<commit_message>
Update core techniques to four microbiology-focused items
Keep only Microbiology Techniques, Molecular Biology, Immunology, and
Microbiology in the online profile and downloadable resume. Remove
Chromatography, Electrophoresis, and Analytical Techniques.

Co-authored-by: seedarlahepsiba <seedarlahepsiba@users.noreply.github.com>
</commit_message>
<xml_diff>
--- a/chitti-profile/jessika_resume.docx
+++ b/chitti-profile/jessika_resume.docx
@@ -1160,7 +1160,7 @@
           <w:sz w:val="21"/>
           <w:szCs w:val="21"/>
         </w:rPr>
-        <w:t xml:space="preserve">Chromatography – </w:t>
+        <w:t xml:space="preserve">Microbiology Techniques – </w:t>
       </w:r>
       <w:r>
         <w:rPr>
@@ -1168,7 +1168,7 @@
           <w:sz w:val="21"/>
           <w:szCs w:val="21"/>
         </w:rPr>
-        <w:t>HPLC and separation-based analytical methods</w:t>
+        <w:t>Bacterial culture, staining techniques, microscopy, and pure culture maintenance</w:t>
       </w:r>
     </w:p>
     <w:p>
@@ -1208,7 +1208,7 @@
           <w:sz w:val="21"/>
           <w:szCs w:val="21"/>
         </w:rPr>
-        <w:t xml:space="preserve">Electrophoresis – </w:t>
+        <w:t xml:space="preserve">Molecular Biology – </w:t>
       </w:r>
       <w:r>
         <w:rPr>
@@ -1216,7 +1216,7 @@
           <w:sz w:val="21"/>
           <w:szCs w:val="21"/>
         </w:rPr>
-        <w:t>Gel electrophoresis and nucleic acid analysis</w:t>
+        <w:t>DNA extraction, gel electrophoresis, and PCR techniques</w:t>
       </w:r>
     </w:p>
     <w:p>
@@ -1256,7 +1256,7 @@
           <w:sz w:val="21"/>
           <w:szCs w:val="21"/>
         </w:rPr>
-        <w:t xml:space="preserve">Analytical Techniques – </w:t>
+        <w:t xml:space="preserve">Immunology – </w:t>
       </w:r>
       <w:r>
         <w:rPr>
@@ -1264,7 +1264,55 @@
           <w:sz w:val="21"/>
           <w:szCs w:val="21"/>
         </w:rPr>
-        <w:t>Foundational familiarity with laboratory analysis workflows and data interpretation</w:t>
+        <w:t>Basic principles of immune response and antigen-antibody interactions</w:t>
+      </w:r>
+    </w:p>
+    <w:p>
+      <w:pPr>
+        <w:spacing w:after="60" w:line="274" w:lineRule="auto"/>
+        <w:ind w:left="317" w:hanging="317"/>
+        <w:rPr>
+          <w:sz w:val="21"/>
+          <w:szCs w:val="21"/>
+        </w:rPr>
+      </w:pPr>
+      <w:r>
+        <w:rPr>
+          <w:rFonts w:eastAsia="Calibri" w:cs="Calibri"/>
+          <w:b/>
+          <w:color w:val="1B4F5C"/>
+          <w:sz w:val="21"/>
+          <w:szCs w:val="21"/>
+        </w:rPr>
+        <w:t>•</w:t>
+      </w:r>
+      <w:r>
+        <w:rPr>
+          <w:rFonts w:eastAsia="Calibri" w:cs="Calibri"/>
+          <w:b/>
+          <w:color w:val="1B4F5C"/>
+          <w:sz w:val="21"/>
+          <w:szCs w:val="21"/>
+        </w:rPr>
+        <w:tab/>
+      </w:r>
+      <w:r>
+        <w:rPr>
+          <w:rFonts w:eastAsia="Calibri" w:cs="Calibri"/>
+          <w:b/>
+          <w:color w:val="1A1A1A"/>
+          <w:sz w:val="21"/>
+          <w:szCs w:val="21"/>
+        </w:rPr>
+        <w:t xml:space="preserve">Microbiology – </w:t>
+      </w:r>
+      <w:r>
+        <w:rPr>
+          <w:rFonts w:eastAsia="Calibri" w:cs="Calibri"/>
+          <w:sz w:val="21"/>
+          <w:szCs w:val="21"/>
+        </w:rPr>
+        <w:t>Culture techniques, staining, and microscopy</w:t>
       </w:r>
     </w:p>
     <w:p>

</xml_diff>

<commit_message>
Restore Analytical Basics and swap core Microbiology for Analytical Techniques
Add Analytical Basics back to Laboratory Skills. In Core Technical
Competencies, replace Microbiology with Analytical Techniques.

Co-authored-by: seedarlahepsiba <seedarlahepsiba@users.noreply.github.com>
</commit_message>
<xml_diff>
--- a/chitti-profile/jessika_resume.docx
+++ b/chitti-profile/jessika_resume.docx
@@ -1042,6 +1042,54 @@
           <w:sz w:val="21"/>
           <w:szCs w:val="21"/>
         </w:rPr>
+        <w:t xml:space="preserve">Analytical Basics – </w:t>
+      </w:r>
+      <w:r>
+        <w:rPr>
+          <w:rFonts w:eastAsia="Calibri" w:cs="Calibri"/>
+          <w:sz w:val="21"/>
+          <w:szCs w:val="21"/>
+        </w:rPr>
+        <w:t>Introductory HPLC exposure and strong academic grounding in scientific analysis</w:t>
+      </w:r>
+    </w:p>
+    <w:p>
+      <w:pPr>
+        <w:spacing w:after="60" w:line="274" w:lineRule="auto"/>
+        <w:ind w:left="317" w:hanging="317"/>
+        <w:rPr>
+          <w:sz w:val="21"/>
+          <w:szCs w:val="21"/>
+        </w:rPr>
+      </w:pPr>
+      <w:r>
+        <w:rPr>
+          <w:rFonts w:eastAsia="Calibri" w:cs="Calibri"/>
+          <w:b/>
+          <w:color w:val="1B4F5C"/>
+          <w:sz w:val="21"/>
+          <w:szCs w:val="21"/>
+        </w:rPr>
+        <w:t>•</w:t>
+      </w:r>
+      <w:r>
+        <w:rPr>
+          <w:rFonts w:eastAsia="Calibri" w:cs="Calibri"/>
+          <w:b/>
+          <w:color w:val="1B4F5C"/>
+          <w:sz w:val="21"/>
+          <w:szCs w:val="21"/>
+        </w:rPr>
+        <w:tab/>
+      </w:r>
+      <w:r>
+        <w:rPr>
+          <w:rFonts w:eastAsia="Calibri" w:cs="Calibri"/>
+          <w:b/>
+          <w:color w:val="1A1A1A"/>
+          <w:sz w:val="21"/>
+          <w:szCs w:val="21"/>
+        </w:rPr>
         <w:t xml:space="preserve">Microbiology – </w:t>
       </w:r>
       <w:r>
@@ -1304,7 +1352,7 @@
           <w:sz w:val="21"/>
           <w:szCs w:val="21"/>
         </w:rPr>
-        <w:t xml:space="preserve">Microbiology – </w:t>
+        <w:t xml:space="preserve">Analytical Techniques – </w:t>
       </w:r>
       <w:r>
         <w:rPr>
@@ -1312,7 +1360,7 @@
           <w:sz w:val="21"/>
           <w:szCs w:val="21"/>
         </w:rPr>
-        <w:t>Culture techniques, staining, and microscopy</w:t>
+        <w:t>Foundational familiarity with laboratory analysis workflows and data interpretation</w:t>
       </w:r>
     </w:p>
     <w:p>

</xml_diff>

<commit_message>
Compact resume spacing to fit on two pages
Slightly reduce section gaps after contact, summary, and objective so
the Availability section no longer spills onto a third page.

Co-authored-by: seedarlahepsiba <seedarlahepsiba@users.noreply.github.com>
</commit_message>
<xml_diff>
--- a/chitti-profile/jessika_resume.docx
+++ b/chitti-profile/jessika_resume.docx
@@ -59,7 +59,7 @@
         <w:pBdr>
           <w:bottom w:val="single" w:sz="6" w:space="1" w:color="D9E2E6"/>
         </w:pBdr>
-        <w:spacing w:after="240"/>
+        <w:spacing w:after="180"/>
         <w:jc w:val="center"/>
         <w:rPr>
           <w:sz w:val="21"/>
@@ -82,7 +82,7 @@
         <w:pBdr>
           <w:bottom w:val="single" w:sz="6" w:space="1" w:color="1B4F5C"/>
         </w:pBdr>
-        <w:spacing w:before="80" w:after="120"/>
+        <w:spacing w:before="80" w:after="80"/>
         <w:rPr>
           <w:sz w:val="21"/>
           <w:szCs w:val="21"/>
@@ -100,7 +100,7 @@
     </w:p>
     <w:p>
       <w:pPr>
-        <w:spacing w:after="120" w:line="276" w:lineRule="auto"/>
+        <w:spacing w:after="80" w:line="276" w:lineRule="auto"/>
         <w:rPr>
           <w:sz w:val="21"/>
           <w:szCs w:val="21"/>
@@ -157,7 +157,7 @@
         <w:pBdr>
           <w:bottom w:val="single" w:sz="6" w:space="1" w:color="1B4F5C"/>
         </w:pBdr>
-        <w:spacing w:before="280" w:after="120"/>
+        <w:spacing w:before="180" w:after="80"/>
         <w:rPr>
           <w:sz w:val="21"/>
           <w:szCs w:val="21"/>
@@ -175,7 +175,7 @@
     </w:p>
     <w:p>
       <w:pPr>
-        <w:spacing w:after="120" w:line="276" w:lineRule="auto"/>
+        <w:spacing w:after="80" w:line="276" w:lineRule="auto"/>
         <w:rPr>
           <w:sz w:val="21"/>
           <w:szCs w:val="21"/>
@@ -196,7 +196,7 @@
         <w:pBdr>
           <w:bottom w:val="single" w:sz="6" w:space="1" w:color="1B4F5C"/>
         </w:pBdr>
-        <w:spacing w:before="280" w:after="120"/>
+        <w:spacing w:before="180" w:after="120"/>
         <w:rPr>
           <w:sz w:val="21"/>
           <w:szCs w:val="21"/>
@@ -1369,7 +1369,7 @@
         <w:pBdr>
           <w:bottom w:val="single" w:sz="6" w:space="1" w:color="1B4F5C"/>
         </w:pBdr>
-        <w:spacing w:before="280" w:after="120"/>
+        <w:spacing w:before="180" w:after="120"/>
         <w:rPr>
           <w:sz w:val="21"/>
           <w:szCs w:val="21"/>
@@ -1679,7 +1679,7 @@
         <w:pBdr>
           <w:bottom w:val="single" w:sz="6" w:space="1" w:color="1B4F5C"/>
         </w:pBdr>
-        <w:spacing w:before="280" w:after="120"/>
+        <w:spacing w:before="180" w:after="120"/>
         <w:rPr>
           <w:sz w:val="21"/>
           <w:szCs w:val="21"/>
@@ -1728,7 +1728,7 @@
         <w:pBdr>
           <w:bottom w:val="single" w:sz="6" w:space="1" w:color="1B4F5C"/>
         </w:pBdr>
-        <w:spacing w:before="280" w:after="120"/>
+        <w:spacing w:before="180" w:after="120"/>
         <w:rPr>
           <w:sz w:val="21"/>
           <w:szCs w:val="21"/>

</xml_diff>

<commit_message>
Replace core competencies with 12 laboratory techniques
Update Core Technical Competencies to PCR, ELISA, Chromatography,
Electrophoresis, Gram staining, Sterilization techniques, DNA isolation,
Blotting techniques, Replication of DNA, Transcription, Translation, and
Data documentation. Tighten spacing to keep the resume within two pages.

Co-authored-by: seedarlahepsiba <seedarlahepsiba@users.noreply.github.com>
</commit_message>
<xml_diff>
--- a/chitti-profile/jessika_resume.docx
+++ b/chitti-profile/jessika_resume.docx
@@ -59,7 +59,7 @@
         <w:pBdr>
           <w:bottom w:val="single" w:sz="6" w:space="1" w:color="D9E2E6"/>
         </w:pBdr>
-        <w:spacing w:after="180"/>
+        <w:spacing w:after="140"/>
         <w:jc w:val="center"/>
         <w:rPr>
           <w:sz w:val="21"/>
@@ -82,7 +82,7 @@
         <w:pBdr>
           <w:bottom w:val="single" w:sz="6" w:space="1" w:color="1B4F5C"/>
         </w:pBdr>
-        <w:spacing w:before="80" w:after="80"/>
+        <w:spacing w:before="80" w:after="60"/>
         <w:rPr>
           <w:sz w:val="21"/>
           <w:szCs w:val="21"/>
@@ -100,7 +100,7 @@
     </w:p>
     <w:p>
       <w:pPr>
-        <w:spacing w:after="80" w:line="276" w:lineRule="auto"/>
+        <w:spacing w:after="60" w:line="259" w:lineRule="auto"/>
         <w:rPr>
           <w:sz w:val="21"/>
           <w:szCs w:val="21"/>
@@ -148,7 +148,7 @@
           <w:sz w:val="21"/>
           <w:szCs w:val="21"/>
         </w:rPr>
-        <w:t xml:space="preserve"> and practical laboratory exposure through dissertation research, academic projects, and analytical laboratory training. Motivated to learn industrial processes, work with SOPs, and grow in QC microbiology, analytical testing, or bioprocess support.</w:t>
+        <w:t xml:space="preserve"> and practical laboratory exposure through dissertation research, academic projects, and analytical laboratory training. Motivated to learn industrial processes, work with SOPs, and grow in QC microbiology and bioprocess support.</w:t>
       </w:r>
     </w:p>
     <w:p>
@@ -157,7 +157,7 @@
         <w:pBdr>
           <w:bottom w:val="single" w:sz="6" w:space="1" w:color="1B4F5C"/>
         </w:pBdr>
-        <w:spacing w:before="180" w:after="80"/>
+        <w:spacing w:before="140" w:after="120"/>
         <w:rPr>
           <w:sz w:val="21"/>
           <w:szCs w:val="21"/>
@@ -175,7 +175,7 @@
     </w:p>
     <w:p>
       <w:pPr>
-        <w:spacing w:after="80" w:line="276" w:lineRule="auto"/>
+        <w:spacing w:after="60" w:line="259" w:lineRule="auto"/>
         <w:rPr>
           <w:sz w:val="21"/>
           <w:szCs w:val="21"/>
@@ -196,7 +196,7 @@
         <w:pBdr>
           <w:bottom w:val="single" w:sz="6" w:space="1" w:color="1B4F5C"/>
         </w:pBdr>
-        <w:spacing w:before="180" w:after="120"/>
+        <w:spacing w:before="140" w:after="120"/>
         <w:rPr>
           <w:sz w:val="21"/>
           <w:szCs w:val="21"/>
@@ -744,7 +744,7 @@
         <w:pBdr>
           <w:bottom w:val="single" w:sz="6" w:space="1" w:color="1B4F5C"/>
         </w:pBdr>
-        <w:spacing w:before="280" w:after="120"/>
+        <w:spacing w:before="140" w:after="120"/>
         <w:rPr>
           <w:sz w:val="21"/>
           <w:szCs w:val="21"/>
@@ -871,7 +871,7 @@
         <w:pBdr>
           <w:bottom w:val="single" w:sz="6" w:space="1" w:color="1B4F5C"/>
         </w:pBdr>
-        <w:spacing w:before="280" w:after="120"/>
+        <w:spacing w:before="140" w:after="120"/>
         <w:rPr>
           <w:sz w:val="21"/>
           <w:szCs w:val="21"/>
@@ -941,7 +941,7 @@
         <w:pBdr>
           <w:bottom w:val="single" w:sz="6" w:space="1" w:color="1B4F5C"/>
         </w:pBdr>
-        <w:spacing w:before="280" w:after="120"/>
+        <w:spacing w:before="140" w:after="120"/>
         <w:rPr>
           <w:sz w:val="21"/>
           <w:szCs w:val="21"/>
@@ -1155,7 +1155,7 @@
         <w:pBdr>
           <w:bottom w:val="single" w:sz="6" w:space="1" w:color="1B4F5C"/>
         </w:pBdr>
-        <w:spacing w:before="280" w:after="120"/>
+        <w:spacing w:before="140" w:after="120"/>
         <w:rPr>
           <w:sz w:val="21"/>
           <w:szCs w:val="21"/>
@@ -1173,7 +1173,7 @@
     </w:p>
     <w:p>
       <w:pPr>
-        <w:spacing w:after="60" w:line="274" w:lineRule="auto"/>
+        <w:spacing w:after="0" w:line="240" w:lineRule="auto"/>
         <w:ind w:left="317" w:hanging="317"/>
         <w:rPr>
           <w:sz w:val="21"/>
@@ -1208,20 +1208,19 @@
           <w:sz w:val="21"/>
           <w:szCs w:val="21"/>
         </w:rPr>
-        <w:t xml:space="preserve">Microbiology Techniques – </w:t>
-      </w:r>
-      <w:r>
-        <w:rPr>
-          <w:rFonts w:eastAsia="Calibri" w:cs="Calibri"/>
-          <w:sz w:val="21"/>
-          <w:szCs w:val="21"/>
-        </w:rPr>
-        <w:t>Bacterial culture, staining techniques, microscopy, and pure culture maintenance</w:t>
+        <w:t>PCR</w:t>
+      </w:r>
+      <w:r>
+        <w:rPr>
+          <w:rFonts w:eastAsia="Calibri" w:cs="Calibri"/>
+          <w:sz w:val="21"/>
+          <w:szCs w:val="21"/>
+        </w:rPr>
       </w:r>
     </w:p>
     <w:p>
       <w:pPr>
-        <w:spacing w:after="60" w:line="274" w:lineRule="auto"/>
+        <w:spacing w:after="0" w:line="240" w:lineRule="auto"/>
         <w:ind w:left="317" w:hanging="317"/>
         <w:rPr>
           <w:sz w:val="21"/>
@@ -1256,20 +1255,19 @@
           <w:sz w:val="21"/>
           <w:szCs w:val="21"/>
         </w:rPr>
-        <w:t xml:space="preserve">Molecular Biology – </w:t>
-      </w:r>
-      <w:r>
-        <w:rPr>
-          <w:rFonts w:eastAsia="Calibri" w:cs="Calibri"/>
-          <w:sz w:val="21"/>
-          <w:szCs w:val="21"/>
-        </w:rPr>
-        <w:t>DNA extraction, gel electrophoresis, and PCR techniques</w:t>
+        <w:t>ELISA</w:t>
+      </w:r>
+      <w:r>
+        <w:rPr>
+          <w:rFonts w:eastAsia="Calibri" w:cs="Calibri"/>
+          <w:sz w:val="21"/>
+          <w:szCs w:val="21"/>
+        </w:rPr>
       </w:r>
     </w:p>
     <w:p>
       <w:pPr>
-        <w:spacing w:after="60" w:line="274" w:lineRule="auto"/>
+        <w:spacing w:after="0" w:line="240" w:lineRule="auto"/>
         <w:ind w:left="317" w:hanging="317"/>
         <w:rPr>
           <w:sz w:val="21"/>
@@ -1304,20 +1302,19 @@
           <w:sz w:val="21"/>
           <w:szCs w:val="21"/>
         </w:rPr>
-        <w:t xml:space="preserve">Immunology – </w:t>
-      </w:r>
-      <w:r>
-        <w:rPr>
-          <w:rFonts w:eastAsia="Calibri" w:cs="Calibri"/>
-          <w:sz w:val="21"/>
-          <w:szCs w:val="21"/>
-        </w:rPr>
-        <w:t>Basic principles of immune response and antigen-antibody interactions</w:t>
+        <w:t>Chromatography</w:t>
+      </w:r>
+      <w:r>
+        <w:rPr>
+          <w:rFonts w:eastAsia="Calibri" w:cs="Calibri"/>
+          <w:sz w:val="21"/>
+          <w:szCs w:val="21"/>
+        </w:rPr>
       </w:r>
     </w:p>
     <w:p>
       <w:pPr>
-        <w:spacing w:after="60" w:line="274" w:lineRule="auto"/>
+        <w:spacing w:after="0" w:line="240" w:lineRule="auto"/>
         <w:ind w:left="317" w:hanging="317"/>
         <w:rPr>
           <w:sz w:val="21"/>
@@ -1352,15 +1349,390 @@
           <w:sz w:val="21"/>
           <w:szCs w:val="21"/>
         </w:rPr>
-        <w:t xml:space="preserve">Analytical Techniques – </w:t>
-      </w:r>
-      <w:r>
-        <w:rPr>
-          <w:rFonts w:eastAsia="Calibri" w:cs="Calibri"/>
-          <w:sz w:val="21"/>
-          <w:szCs w:val="21"/>
-        </w:rPr>
-        <w:t>Foundational familiarity with laboratory analysis workflows and data interpretation</w:t>
+        <w:t>Electrophoresis</w:t>
+      </w:r>
+      <w:r>
+        <w:rPr>
+          <w:rFonts w:eastAsia="Calibri" w:cs="Calibri"/>
+          <w:sz w:val="21"/>
+          <w:szCs w:val="21"/>
+        </w:rPr>
+      </w:r>
+    </w:p>
+    <w:p>
+      <w:pPr>
+        <w:spacing w:after="0" w:line="240" w:lineRule="auto"/>
+        <w:ind w:left="317" w:hanging="317"/>
+        <w:rPr>
+          <w:sz w:val="21"/>
+          <w:szCs w:val="21"/>
+        </w:rPr>
+      </w:pPr>
+      <w:r>
+        <w:rPr>
+          <w:rFonts w:eastAsia="Calibri" w:cs="Calibri"/>
+          <w:b/>
+          <w:color w:val="1B4F5C"/>
+          <w:sz w:val="21"/>
+          <w:szCs w:val="21"/>
+        </w:rPr>
+        <w:t>•</w:t>
+      </w:r>
+      <w:r>
+        <w:rPr>
+          <w:rFonts w:eastAsia="Calibri" w:cs="Calibri"/>
+          <w:b/>
+          <w:color w:val="1B4F5C"/>
+          <w:sz w:val="21"/>
+          <w:szCs w:val="21"/>
+        </w:rPr>
+        <w:tab/>
+      </w:r>
+      <w:r>
+        <w:rPr>
+          <w:rFonts w:eastAsia="Calibri" w:cs="Calibri"/>
+          <w:b/>
+          <w:color w:val="1A1A1A"/>
+          <w:sz w:val="21"/>
+          <w:szCs w:val="21"/>
+        </w:rPr>
+        <w:t>Gram staining</w:t>
+      </w:r>
+      <w:r>
+        <w:rPr>
+          <w:rFonts w:eastAsia="Calibri" w:cs="Calibri"/>
+          <w:sz w:val="21"/>
+          <w:szCs w:val="21"/>
+        </w:rPr>
+      </w:r>
+    </w:p>
+    <w:p>
+      <w:pPr>
+        <w:spacing w:after="0" w:line="240" w:lineRule="auto"/>
+        <w:ind w:left="317" w:hanging="317"/>
+        <w:rPr>
+          <w:sz w:val="21"/>
+          <w:szCs w:val="21"/>
+        </w:rPr>
+      </w:pPr>
+      <w:r>
+        <w:rPr>
+          <w:rFonts w:eastAsia="Calibri" w:cs="Calibri"/>
+          <w:b/>
+          <w:color w:val="1B4F5C"/>
+          <w:sz w:val="21"/>
+          <w:szCs w:val="21"/>
+        </w:rPr>
+        <w:t>•</w:t>
+      </w:r>
+      <w:r>
+        <w:rPr>
+          <w:rFonts w:eastAsia="Calibri" w:cs="Calibri"/>
+          <w:b/>
+          <w:color w:val="1B4F5C"/>
+          <w:sz w:val="21"/>
+          <w:szCs w:val="21"/>
+        </w:rPr>
+        <w:tab/>
+      </w:r>
+      <w:r>
+        <w:rPr>
+          <w:rFonts w:eastAsia="Calibri" w:cs="Calibri"/>
+          <w:b/>
+          <w:color w:val="1A1A1A"/>
+          <w:sz w:val="21"/>
+          <w:szCs w:val="21"/>
+        </w:rPr>
+        <w:t>Sterilization techniques</w:t>
+      </w:r>
+      <w:r>
+        <w:rPr>
+          <w:rFonts w:eastAsia="Calibri" w:cs="Calibri"/>
+          <w:sz w:val="21"/>
+          <w:szCs w:val="21"/>
+        </w:rPr>
+      </w:r>
+    </w:p>
+    <w:p>
+      <w:pPr>
+        <w:spacing w:after="0" w:line="240" w:lineRule="auto"/>
+        <w:ind w:left="317" w:hanging="317"/>
+        <w:rPr>
+          <w:sz w:val="21"/>
+          <w:szCs w:val="21"/>
+        </w:rPr>
+      </w:pPr>
+      <w:r>
+        <w:rPr>
+          <w:rFonts w:eastAsia="Calibri" w:cs="Calibri"/>
+          <w:b/>
+          <w:color w:val="1B4F5C"/>
+          <w:sz w:val="21"/>
+          <w:szCs w:val="21"/>
+        </w:rPr>
+        <w:t>•</w:t>
+      </w:r>
+      <w:r>
+        <w:rPr>
+          <w:rFonts w:eastAsia="Calibri" w:cs="Calibri"/>
+          <w:b/>
+          <w:color w:val="1B4F5C"/>
+          <w:sz w:val="21"/>
+          <w:szCs w:val="21"/>
+        </w:rPr>
+        <w:tab/>
+      </w:r>
+      <w:r>
+        <w:rPr>
+          <w:rFonts w:eastAsia="Calibri" w:cs="Calibri"/>
+          <w:b/>
+          <w:color w:val="1A1A1A"/>
+          <w:sz w:val="21"/>
+          <w:szCs w:val="21"/>
+        </w:rPr>
+        <w:t>DNA isolation</w:t>
+      </w:r>
+      <w:r>
+        <w:rPr>
+          <w:rFonts w:eastAsia="Calibri" w:cs="Calibri"/>
+          <w:sz w:val="21"/>
+          <w:szCs w:val="21"/>
+        </w:rPr>
+      </w:r>
+    </w:p>
+    <w:p>
+      <w:pPr>
+        <w:spacing w:after="0" w:line="240" w:lineRule="auto"/>
+        <w:ind w:left="317" w:hanging="317"/>
+        <w:rPr>
+          <w:sz w:val="21"/>
+          <w:szCs w:val="21"/>
+        </w:rPr>
+      </w:pPr>
+      <w:r>
+        <w:rPr>
+          <w:rFonts w:eastAsia="Calibri" w:cs="Calibri"/>
+          <w:b/>
+          <w:color w:val="1B4F5C"/>
+          <w:sz w:val="21"/>
+          <w:szCs w:val="21"/>
+        </w:rPr>
+        <w:t>•</w:t>
+      </w:r>
+      <w:r>
+        <w:rPr>
+          <w:rFonts w:eastAsia="Calibri" w:cs="Calibri"/>
+          <w:b/>
+          <w:color w:val="1B4F5C"/>
+          <w:sz w:val="21"/>
+          <w:szCs w:val="21"/>
+        </w:rPr>
+        <w:tab/>
+      </w:r>
+      <w:r>
+        <w:rPr>
+          <w:rFonts w:eastAsia="Calibri" w:cs="Calibri"/>
+          <w:b/>
+          <w:color w:val="1A1A1A"/>
+          <w:sz w:val="21"/>
+          <w:szCs w:val="21"/>
+        </w:rPr>
+        <w:t>Blotting techniques</w:t>
+      </w:r>
+      <w:r>
+        <w:rPr>
+          <w:rFonts w:eastAsia="Calibri" w:cs="Calibri"/>
+          <w:sz w:val="21"/>
+          <w:szCs w:val="21"/>
+        </w:rPr>
+      </w:r>
+    </w:p>
+    <w:p>
+      <w:pPr>
+        <w:spacing w:after="0" w:line="240" w:lineRule="auto"/>
+        <w:ind w:left="317" w:hanging="317"/>
+        <w:rPr>
+          <w:sz w:val="21"/>
+          <w:szCs w:val="21"/>
+        </w:rPr>
+      </w:pPr>
+      <w:r>
+        <w:rPr>
+          <w:rFonts w:eastAsia="Calibri" w:cs="Calibri"/>
+          <w:b/>
+          <w:color w:val="1B4F5C"/>
+          <w:sz w:val="21"/>
+          <w:szCs w:val="21"/>
+        </w:rPr>
+        <w:t>•</w:t>
+      </w:r>
+      <w:r>
+        <w:rPr>
+          <w:rFonts w:eastAsia="Calibri" w:cs="Calibri"/>
+          <w:b/>
+          <w:color w:val="1B4F5C"/>
+          <w:sz w:val="21"/>
+          <w:szCs w:val="21"/>
+        </w:rPr>
+        <w:tab/>
+      </w:r>
+      <w:r>
+        <w:rPr>
+          <w:rFonts w:eastAsia="Calibri" w:cs="Calibri"/>
+          <w:b/>
+          <w:color w:val="1A1A1A"/>
+          <w:sz w:val="21"/>
+          <w:szCs w:val="21"/>
+        </w:rPr>
+        <w:t>Replication of DNA</w:t>
+      </w:r>
+      <w:r>
+        <w:rPr>
+          <w:rFonts w:eastAsia="Calibri" w:cs="Calibri"/>
+          <w:sz w:val="21"/>
+          <w:szCs w:val="21"/>
+        </w:rPr>
+      </w:r>
+    </w:p>
+    <w:p>
+      <w:pPr>
+        <w:spacing w:after="0" w:line="240" w:lineRule="auto"/>
+        <w:ind w:left="317" w:hanging="317"/>
+        <w:rPr>
+          <w:sz w:val="21"/>
+          <w:szCs w:val="21"/>
+        </w:rPr>
+      </w:pPr>
+      <w:r>
+        <w:rPr>
+          <w:rFonts w:eastAsia="Calibri" w:cs="Calibri"/>
+          <w:b/>
+          <w:color w:val="1B4F5C"/>
+          <w:sz w:val="21"/>
+          <w:szCs w:val="21"/>
+        </w:rPr>
+        <w:t>•</w:t>
+      </w:r>
+      <w:r>
+        <w:rPr>
+          <w:rFonts w:eastAsia="Calibri" w:cs="Calibri"/>
+          <w:b/>
+          <w:color w:val="1B4F5C"/>
+          <w:sz w:val="21"/>
+          <w:szCs w:val="21"/>
+        </w:rPr>
+        <w:tab/>
+      </w:r>
+      <w:r>
+        <w:rPr>
+          <w:rFonts w:eastAsia="Calibri" w:cs="Calibri"/>
+          <w:b/>
+          <w:color w:val="1A1A1A"/>
+          <w:sz w:val="21"/>
+          <w:szCs w:val="21"/>
+        </w:rPr>
+        <w:t>Transcription</w:t>
+      </w:r>
+      <w:r>
+        <w:rPr>
+          <w:rFonts w:eastAsia="Calibri" w:cs="Calibri"/>
+          <w:sz w:val="21"/>
+          <w:szCs w:val="21"/>
+        </w:rPr>
+      </w:r>
+    </w:p>
+    <w:p>
+      <w:pPr>
+        <w:spacing w:after="0" w:line="240" w:lineRule="auto"/>
+        <w:ind w:left="317" w:hanging="317"/>
+        <w:rPr>
+          <w:sz w:val="21"/>
+          <w:szCs w:val="21"/>
+        </w:rPr>
+      </w:pPr>
+      <w:r>
+        <w:rPr>
+          <w:rFonts w:eastAsia="Calibri" w:cs="Calibri"/>
+          <w:b/>
+          <w:color w:val="1B4F5C"/>
+          <w:sz w:val="21"/>
+          <w:szCs w:val="21"/>
+        </w:rPr>
+        <w:t>•</w:t>
+      </w:r>
+      <w:r>
+        <w:rPr>
+          <w:rFonts w:eastAsia="Calibri" w:cs="Calibri"/>
+          <w:b/>
+          <w:color w:val="1B4F5C"/>
+          <w:sz w:val="21"/>
+          <w:szCs w:val="21"/>
+        </w:rPr>
+        <w:tab/>
+      </w:r>
+      <w:r>
+        <w:rPr>
+          <w:rFonts w:eastAsia="Calibri" w:cs="Calibri"/>
+          <w:b/>
+          <w:color w:val="1A1A1A"/>
+          <w:sz w:val="21"/>
+          <w:szCs w:val="21"/>
+        </w:rPr>
+        <w:t>Translation</w:t>
+      </w:r>
+      <w:r>
+        <w:rPr>
+          <w:rFonts w:eastAsia="Calibri" w:cs="Calibri"/>
+          <w:sz w:val="21"/>
+          <w:szCs w:val="21"/>
+        </w:rPr>
+      </w:r>
+    </w:p>
+    <w:p>
+      <w:pPr>
+        <w:spacing w:after="0" w:line="240" w:lineRule="auto"/>
+        <w:ind w:left="317" w:hanging="317"/>
+        <w:rPr>
+          <w:sz w:val="21"/>
+          <w:szCs w:val="21"/>
+        </w:rPr>
+      </w:pPr>
+      <w:r>
+        <w:rPr>
+          <w:rFonts w:eastAsia="Calibri" w:cs="Calibri"/>
+          <w:b/>
+          <w:color w:val="1B4F5C"/>
+          <w:sz w:val="21"/>
+          <w:szCs w:val="21"/>
+        </w:rPr>
+        <w:t>•</w:t>
+      </w:r>
+      <w:r>
+        <w:rPr>
+          <w:rFonts w:eastAsia="Calibri" w:cs="Calibri"/>
+          <w:b/>
+          <w:color w:val="1B4F5C"/>
+          <w:sz w:val="21"/>
+          <w:szCs w:val="21"/>
+        </w:rPr>
+        <w:tab/>
+      </w:r>
+      <w:r>
+        <w:rPr>
+          <w:rFonts w:eastAsia="Calibri" w:cs="Calibri"/>
+          <w:b/>
+          <w:color w:val="1A1A1A"/>
+          <w:sz w:val="21"/>
+          <w:szCs w:val="21"/>
+        </w:rPr>
+        <w:t>Data documentation</w:t>
+      </w:r>
+      <w:r>
+        <w:rPr>
+          <w:rFonts w:eastAsia="Calibri" w:cs="Calibri"/>
+          <w:sz w:val="21"/>
+          <w:szCs w:val="21"/>
+        </w:rPr>
       </w:r>
     </w:p>
     <w:p>
@@ -1369,7 +1741,7 @@
         <w:pBdr>
           <w:bottom w:val="single" w:sz="6" w:space="1" w:color="1B4F5C"/>
         </w:pBdr>
-        <w:spacing w:before="180" w:after="120"/>
+        <w:spacing w:before="140" w:after="120"/>
         <w:rPr>
           <w:sz w:val="21"/>
           <w:szCs w:val="21"/>
@@ -1679,7 +2051,7 @@
         <w:pBdr>
           <w:bottom w:val="single" w:sz="6" w:space="1" w:color="1B4F5C"/>
         </w:pBdr>
-        <w:spacing w:before="180" w:after="120"/>
+        <w:spacing w:before="140" w:after="120"/>
         <w:rPr>
           <w:sz w:val="21"/>
           <w:szCs w:val="21"/>
@@ -1728,7 +2100,7 @@
         <w:pBdr>
           <w:bottom w:val="single" w:sz="6" w:space="1" w:color="1B4F5C"/>
         </w:pBdr>
-        <w:spacing w:before="180" w:after="120"/>
+        <w:spacing w:before="140" w:after="120"/>
         <w:rPr>
           <w:sz w:val="21"/>
           <w:szCs w:val="21"/>
@@ -1746,7 +2118,7 @@
     </w:p>
     <w:p>
       <w:pPr>
-        <w:spacing w:after="100" w:line="274" w:lineRule="auto"/>
+        <w:spacing w:after="40" w:line="252" w:lineRule="auto"/>
         <w:rPr>
           <w:sz w:val="21"/>
           <w:szCs w:val="21"/>
@@ -1773,7 +2145,7 @@
     </w:p>
     <w:p>
       <w:pPr>
-        <w:spacing w:after="100" w:line="274" w:lineRule="auto"/>
+        <w:spacing w:after="40" w:line="252" w:lineRule="auto"/>
         <w:rPr>
           <w:sz w:val="21"/>
           <w:szCs w:val="21"/>

</xml_diff>

<commit_message>
Add one-line descriptions for each core competency
Include a brief single-line description for all 12 core technical
competencies in the resume and online profile while keeping the PDF
within two pages.

Co-authored-by: seedarlahepsiba <seedarlahepsiba@users.noreply.github.com>
</commit_message>
<xml_diff>
--- a/chitti-profile/jessika_resume.docx
+++ b/chitti-profile/jessika_resume.docx
@@ -1208,14 +1208,15 @@
           <w:sz w:val="21"/>
           <w:szCs w:val="21"/>
         </w:rPr>
-        <w:t>PCR</w:t>
-      </w:r>
-      <w:r>
-        <w:rPr>
-          <w:rFonts w:eastAsia="Calibri" w:cs="Calibri"/>
-          <w:sz w:val="21"/>
-          <w:szCs w:val="21"/>
-        </w:rPr>
+        <w:t xml:space="preserve">PCR – </w:t>
+      </w:r>
+      <w:r>
+        <w:rPr>
+          <w:rFonts w:eastAsia="Calibri" w:cs="Calibri"/>
+          <w:sz w:val="21"/>
+          <w:szCs w:val="21"/>
+        </w:rPr>
+        <w:t>Amplification and analysis of target DNA sequences</w:t>
       </w:r>
     </w:p>
     <w:p>
@@ -1255,14 +1256,15 @@
           <w:sz w:val="21"/>
           <w:szCs w:val="21"/>
         </w:rPr>
-        <w:t>ELISA</w:t>
-      </w:r>
-      <w:r>
-        <w:rPr>
-          <w:rFonts w:eastAsia="Calibri" w:cs="Calibri"/>
-          <w:sz w:val="21"/>
-          <w:szCs w:val="21"/>
-        </w:rPr>
+        <w:t xml:space="preserve">ELISA – </w:t>
+      </w:r>
+      <w:r>
+        <w:rPr>
+          <w:rFonts w:eastAsia="Calibri" w:cs="Calibri"/>
+          <w:sz w:val="21"/>
+          <w:szCs w:val="21"/>
+        </w:rPr>
+        <w:t>Antigen-antibody detection for qualitative and quantitative assays</w:t>
       </w:r>
     </w:p>
     <w:p>
@@ -1302,14 +1304,15 @@
           <w:sz w:val="21"/>
           <w:szCs w:val="21"/>
         </w:rPr>
-        <w:t>Chromatography</w:t>
-      </w:r>
-      <w:r>
-        <w:rPr>
-          <w:rFonts w:eastAsia="Calibri" w:cs="Calibri"/>
-          <w:sz w:val="21"/>
-          <w:szCs w:val="21"/>
-        </w:rPr>
+        <w:t xml:space="preserve">Chromatography – </w:t>
+      </w:r>
+      <w:r>
+        <w:rPr>
+          <w:rFonts w:eastAsia="Calibri" w:cs="Calibri"/>
+          <w:sz w:val="21"/>
+          <w:szCs w:val="21"/>
+        </w:rPr>
+        <w:t>Separation and analysis of compounds using HPLC and related methods</w:t>
       </w:r>
     </w:p>
     <w:p>
@@ -1349,14 +1352,15 @@
           <w:sz w:val="21"/>
           <w:szCs w:val="21"/>
         </w:rPr>
-        <w:t>Electrophoresis</w:t>
-      </w:r>
-      <w:r>
-        <w:rPr>
-          <w:rFonts w:eastAsia="Calibri" w:cs="Calibri"/>
-          <w:sz w:val="21"/>
-          <w:szCs w:val="21"/>
-        </w:rPr>
+        <w:t xml:space="preserve">Electrophoresis – </w:t>
+      </w:r>
+      <w:r>
+        <w:rPr>
+          <w:rFonts w:eastAsia="Calibri" w:cs="Calibri"/>
+          <w:sz w:val="21"/>
+          <w:szCs w:val="21"/>
+        </w:rPr>
+        <w:t>Gel-based separation of nucleic acids and proteins</w:t>
       </w:r>
     </w:p>
     <w:p>
@@ -1396,14 +1400,15 @@
           <w:sz w:val="21"/>
           <w:szCs w:val="21"/>
         </w:rPr>
-        <w:t>Gram staining</w:t>
-      </w:r>
-      <w:r>
-        <w:rPr>
-          <w:rFonts w:eastAsia="Calibri" w:cs="Calibri"/>
-          <w:sz w:val="21"/>
-          <w:szCs w:val="21"/>
-        </w:rPr>
+        <w:t xml:space="preserve">Gram staining – </w:t>
+      </w:r>
+      <w:r>
+        <w:rPr>
+          <w:rFonts w:eastAsia="Calibri" w:cs="Calibri"/>
+          <w:sz w:val="21"/>
+          <w:szCs w:val="21"/>
+        </w:rPr>
+        <w:t>Differentiation of bacteria using Gram-positive and Gram-negative staining</w:t>
       </w:r>
     </w:p>
     <w:p>
@@ -1443,14 +1448,15 @@
           <w:sz w:val="21"/>
           <w:szCs w:val="21"/>
         </w:rPr>
-        <w:t>Sterilization techniques</w:t>
-      </w:r>
-      <w:r>
-        <w:rPr>
-          <w:rFonts w:eastAsia="Calibri" w:cs="Calibri"/>
-          <w:sz w:val="21"/>
-          <w:szCs w:val="21"/>
-        </w:rPr>
+        <w:t xml:space="preserve">Sterilization techniques – </w:t>
+      </w:r>
+      <w:r>
+        <w:rPr>
+          <w:rFonts w:eastAsia="Calibri" w:cs="Calibri"/>
+          <w:sz w:val="21"/>
+          <w:szCs w:val="21"/>
+        </w:rPr>
+        <w:t>Aseptic handling, autoclaving, and contamination control methods</w:t>
       </w:r>
     </w:p>
     <w:p>
@@ -1490,14 +1496,15 @@
           <w:sz w:val="21"/>
           <w:szCs w:val="21"/>
         </w:rPr>
-        <w:t>DNA isolation</w:t>
-      </w:r>
-      <w:r>
-        <w:rPr>
-          <w:rFonts w:eastAsia="Calibri" w:cs="Calibri"/>
-          <w:sz w:val="21"/>
-          <w:szCs w:val="21"/>
-        </w:rPr>
+        <w:t xml:space="preserve">DNA isolation – </w:t>
+      </w:r>
+      <w:r>
+        <w:rPr>
+          <w:rFonts w:eastAsia="Calibri" w:cs="Calibri"/>
+          <w:sz w:val="21"/>
+          <w:szCs w:val="21"/>
+        </w:rPr>
+        <w:t>Extraction and purification of genomic DNA from biological samples</w:t>
       </w:r>
     </w:p>
     <w:p>
@@ -1537,14 +1544,15 @@
           <w:sz w:val="21"/>
           <w:szCs w:val="21"/>
         </w:rPr>
-        <w:t>Blotting techniques</w:t>
-      </w:r>
-      <w:r>
-        <w:rPr>
-          <w:rFonts w:eastAsia="Calibri" w:cs="Calibri"/>
-          <w:sz w:val="21"/>
-          <w:szCs w:val="21"/>
-        </w:rPr>
+        <w:t xml:space="preserve">Blotting techniques – </w:t>
+      </w:r>
+      <w:r>
+        <w:rPr>
+          <w:rFonts w:eastAsia="Calibri" w:cs="Calibri"/>
+          <w:sz w:val="21"/>
+          <w:szCs w:val="21"/>
+        </w:rPr>
+        <w:t>Southern, Northern, and Western blot methods for molecular analysis</w:t>
       </w:r>
     </w:p>
     <w:p>
@@ -1584,14 +1592,15 @@
           <w:sz w:val="21"/>
           <w:szCs w:val="21"/>
         </w:rPr>
-        <w:t>Replication of DNA</w:t>
-      </w:r>
-      <w:r>
-        <w:rPr>
-          <w:rFonts w:eastAsia="Calibri" w:cs="Calibri"/>
-          <w:sz w:val="21"/>
-          <w:szCs w:val="21"/>
-        </w:rPr>
+        <w:t xml:space="preserve">Replication of DNA – </w:t>
+      </w:r>
+      <w:r>
+        <w:rPr>
+          <w:rFonts w:eastAsia="Calibri" w:cs="Calibri"/>
+          <w:sz w:val="21"/>
+          <w:szCs w:val="21"/>
+        </w:rPr>
+        <w:t>Understanding of DNA replication mechanisms and laboratory applications</w:t>
       </w:r>
     </w:p>
     <w:p>
@@ -1631,14 +1640,15 @@
           <w:sz w:val="21"/>
           <w:szCs w:val="21"/>
         </w:rPr>
-        <w:t>Transcription</w:t>
-      </w:r>
-      <w:r>
-        <w:rPr>
-          <w:rFonts w:eastAsia="Calibri" w:cs="Calibri"/>
-          <w:sz w:val="21"/>
-          <w:szCs w:val="21"/>
-        </w:rPr>
+        <w:t xml:space="preserve">Transcription – </w:t>
+      </w:r>
+      <w:r>
+        <w:rPr>
+          <w:rFonts w:eastAsia="Calibri" w:cs="Calibri"/>
+          <w:sz w:val="21"/>
+          <w:szCs w:val="21"/>
+        </w:rPr>
+        <w:t>RNA synthesis principles and gene expression analysis</w:t>
       </w:r>
     </w:p>
     <w:p>
@@ -1678,14 +1688,15 @@
           <w:sz w:val="21"/>
           <w:szCs w:val="21"/>
         </w:rPr>
-        <w:t>Translation</w:t>
-      </w:r>
-      <w:r>
-        <w:rPr>
-          <w:rFonts w:eastAsia="Calibri" w:cs="Calibri"/>
-          <w:sz w:val="21"/>
-          <w:szCs w:val="21"/>
-        </w:rPr>
+        <w:t xml:space="preserve">Translation – </w:t>
+      </w:r>
+      <w:r>
+        <w:rPr>
+          <w:rFonts w:eastAsia="Calibri" w:cs="Calibri"/>
+          <w:sz w:val="21"/>
+          <w:szCs w:val="21"/>
+        </w:rPr>
+        <w:t>Protein synthesis processes and molecular biology applications</w:t>
       </w:r>
     </w:p>
     <w:p>
@@ -1725,14 +1736,15 @@
           <w:sz w:val="21"/>
           <w:szCs w:val="21"/>
         </w:rPr>
-        <w:t>Data documentation</w:t>
-      </w:r>
-      <w:r>
-        <w:rPr>
-          <w:rFonts w:eastAsia="Calibri" w:cs="Calibri"/>
-          <w:sz w:val="21"/>
-          <w:szCs w:val="21"/>
-        </w:rPr>
+        <w:t xml:space="preserve">Data documentation – </w:t>
+      </w:r>
+      <w:r>
+        <w:rPr>
+          <w:rFonts w:eastAsia="Calibri" w:cs="Calibri"/>
+          <w:sz w:val="21"/>
+          <w:szCs w:val="21"/>
+        </w:rPr>
+        <w:t>Accurate recording, reporting, and traceability of laboratory results</w:t>
       </w:r>
     </w:p>
     <w:p>

</xml_diff>

<commit_message>
Trim core competencies to 10 requested items
Keep PCR, ELISA, Chromatography, Electrophoresis, Gram staining,
Sterilization techniques, DNA isolation, Blotting techniques, Central
dogma of molecular biology, and Data documentation with one-line
descriptions. Remove Replication, Transcription, and Translation.

Co-authored-by: seedarlahepsiba <seedarlahepsiba@users.noreply.github.com>
</commit_message>
<xml_diff>
--- a/chitti-profile/jessika_resume.docx
+++ b/chitti-profile/jessika_resume.docx
@@ -1592,7 +1592,7 @@
           <w:sz w:val="21"/>
           <w:szCs w:val="21"/>
         </w:rPr>
-        <w:t xml:space="preserve">Replication of DNA – </w:t>
+        <w:t xml:space="preserve">Central dogma of molecular biology – </w:t>
       </w:r>
       <w:r>
         <w:rPr>
@@ -1600,103 +1600,7 @@
           <w:sz w:val="21"/>
           <w:szCs w:val="21"/>
         </w:rPr>
-        <w:t>Understanding of DNA replication mechanisms and laboratory applications</w:t>
-      </w:r>
-    </w:p>
-    <w:p>
-      <w:pPr>
-        <w:spacing w:after="0" w:line="240" w:lineRule="auto"/>
-        <w:ind w:left="317" w:hanging="317"/>
-        <w:rPr>
-          <w:sz w:val="21"/>
-          <w:szCs w:val="21"/>
-        </w:rPr>
-      </w:pPr>
-      <w:r>
-        <w:rPr>
-          <w:rFonts w:eastAsia="Calibri" w:cs="Calibri"/>
-          <w:b/>
-          <w:color w:val="1B4F5C"/>
-          <w:sz w:val="21"/>
-          <w:szCs w:val="21"/>
-        </w:rPr>
-        <w:t>•</w:t>
-      </w:r>
-      <w:r>
-        <w:rPr>
-          <w:rFonts w:eastAsia="Calibri" w:cs="Calibri"/>
-          <w:b/>
-          <w:color w:val="1B4F5C"/>
-          <w:sz w:val="21"/>
-          <w:szCs w:val="21"/>
-        </w:rPr>
-        <w:tab/>
-      </w:r>
-      <w:r>
-        <w:rPr>
-          <w:rFonts w:eastAsia="Calibri" w:cs="Calibri"/>
-          <w:b/>
-          <w:color w:val="1A1A1A"/>
-          <w:sz w:val="21"/>
-          <w:szCs w:val="21"/>
-        </w:rPr>
-        <w:t xml:space="preserve">Transcription – </w:t>
-      </w:r>
-      <w:r>
-        <w:rPr>
-          <w:rFonts w:eastAsia="Calibri" w:cs="Calibri"/>
-          <w:sz w:val="21"/>
-          <w:szCs w:val="21"/>
-        </w:rPr>
-        <w:t>RNA synthesis principles and gene expression analysis</w:t>
-      </w:r>
-    </w:p>
-    <w:p>
-      <w:pPr>
-        <w:spacing w:after="0" w:line="240" w:lineRule="auto"/>
-        <w:ind w:left="317" w:hanging="317"/>
-        <w:rPr>
-          <w:sz w:val="21"/>
-          <w:szCs w:val="21"/>
-        </w:rPr>
-      </w:pPr>
-      <w:r>
-        <w:rPr>
-          <w:rFonts w:eastAsia="Calibri" w:cs="Calibri"/>
-          <w:b/>
-          <w:color w:val="1B4F5C"/>
-          <w:sz w:val="21"/>
-          <w:szCs w:val="21"/>
-        </w:rPr>
-        <w:t>•</w:t>
-      </w:r>
-      <w:r>
-        <w:rPr>
-          <w:rFonts w:eastAsia="Calibri" w:cs="Calibri"/>
-          <w:b/>
-          <w:color w:val="1B4F5C"/>
-          <w:sz w:val="21"/>
-          <w:szCs w:val="21"/>
-        </w:rPr>
-        <w:tab/>
-      </w:r>
-      <w:r>
-        <w:rPr>
-          <w:rFonts w:eastAsia="Calibri" w:cs="Calibri"/>
-          <w:b/>
-          <w:color w:val="1A1A1A"/>
-          <w:sz w:val="21"/>
-          <w:szCs w:val="21"/>
-        </w:rPr>
-        <w:t xml:space="preserve">Translation – </w:t>
-      </w:r>
-      <w:r>
-        <w:rPr>
-          <w:rFonts w:eastAsia="Calibri" w:cs="Calibri"/>
-          <w:sz w:val="21"/>
-          <w:szCs w:val="21"/>
-        </w:rPr>
-        <w:t>Protein synthesis processes and molecular biology applications</w:t>
+        <w:t>Understanding of DNA replication, transcription, and translation in gene expression</w:t>
       </w:r>
     </w:p>
     <w:p>

</xml_diff>

<commit_message>
Move Academic Achievements after skills and internships
Reorder resume and online profile sections so Academic Achievements
appears after Academic Projects, Laboratory Skills, and Core Technical
Competencies. Add reorder_sections() to the resume generator, update
jessika_resume.html, and add Projects and Achievements sections to the
animated profile page.

Co-authored-by: seedarlahepsiba <seedarlahepsiba@users.noreply.github.com>
</commit_message>
<xml_diff>
--- a/chitti-profile/jessika_resume.docx
+++ b/chitti-profile/jessika_resume.docx
@@ -434,7 +434,7 @@
         <w:pBdr>
           <w:bottom w:val="single" w:sz="6" w:space="1" w:color="1B4F5C"/>
         </w:pBdr>
-        <w:spacing w:before="280" w:after="120"/>
+        <w:spacing w:before="140" w:after="120"/>
         <w:rPr>
           <w:sz w:val="21"/>
           <w:szCs w:val="21"/>
@@ -447,7 +447,7 @@
           <w:color w:val="1B4F5C"/>
           <w:szCs w:val="21"/>
         </w:rPr>
-        <w:t>Academic Achievements</w:t>
+        <w:t>Academic Projects &amp; Laboratory Training</w:t>
       </w:r>
     </w:p>
     <w:p>
@@ -487,7 +487,7 @@
           <w:sz w:val="21"/>
           <w:szCs w:val="21"/>
         </w:rPr>
-        <w:t xml:space="preserve">Gold Medal in M.Sc. Biotechnology – </w:t>
+        <w:t xml:space="preserve">M.Sc. Dissertation Project – Krishna University, Machilipatnam – </w:t>
       </w:r>
       <w:r>
         <w:rPr>
@@ -495,7 +495,16 @@
           <w:sz w:val="21"/>
           <w:szCs w:val="21"/>
         </w:rPr>
-        <w:t>Awarded for outstanding academic performance at Krishna University, Machilipatnam</w:t>
+        <w:t xml:space="preserve">Isolated and characterized lactic acid bacteria (LAB) from spontaneously fermented fruits including apple, orange, grape, and lemon through aseptic sampling, serial dilution, and selective plating on MRS agar. Purified cultures by repeated streaking and confirmed LAB identity using </w:t>
+      </w:r>
+      <w:r>
+        <w:rPr>
+          <w:rFonts w:eastAsia="Calibri" w:cs="Calibri"/>
+          <w:sz w:val="21"/>
+          <w:szCs w:val="21"/>
+        </w:rPr>
+        <w:lastRenderedPageBreak/>
+        <w:t>Gram staining, catalase, and oxidase tests, recording colony morphology and microbial growth under controlled incubation.</w:t>
       </w:r>
     </w:p>
     <w:p>
@@ -535,7 +544,7 @@
           <w:sz w:val="21"/>
           <w:szCs w:val="21"/>
         </w:rPr>
-        <w:t xml:space="preserve">Ranked 1st in B.Sc. Biotechnology – </w:t>
+        <w:t xml:space="preserve">Analytical Laboratory Training – CMS Laboratories – </w:t>
       </w:r>
       <w:r>
         <w:rPr>
@@ -543,199 +552,7 @@
           <w:sz w:val="21"/>
           <w:szCs w:val="21"/>
         </w:rPr>
-        <w:t>Consistently topped all semesters at Harshini Degree College</w:t>
-      </w:r>
-    </w:p>
-    <w:p>
-      <w:pPr>
-        <w:spacing w:after="60" w:line="274" w:lineRule="auto"/>
-        <w:ind w:left="317" w:hanging="317"/>
-        <w:rPr>
-          <w:sz w:val="21"/>
-          <w:szCs w:val="21"/>
-        </w:rPr>
-      </w:pPr>
-      <w:r>
-        <w:rPr>
-          <w:rFonts w:eastAsia="Calibri" w:cs="Calibri"/>
-          <w:b/>
-          <w:color w:val="1B4F5C"/>
-          <w:sz w:val="21"/>
-          <w:szCs w:val="21"/>
-        </w:rPr>
-        <w:t>•</w:t>
-      </w:r>
-      <w:r>
-        <w:rPr>
-          <w:rFonts w:eastAsia="Calibri" w:cs="Calibri"/>
-          <w:b/>
-          <w:color w:val="1B4F5C"/>
-          <w:sz w:val="21"/>
-          <w:szCs w:val="21"/>
-        </w:rPr>
-        <w:tab/>
-      </w:r>
-      <w:r>
-        <w:rPr>
-          <w:rFonts w:eastAsia="Calibri" w:cs="Calibri"/>
-          <w:b/>
-          <w:color w:val="1A1A1A"/>
-          <w:sz w:val="21"/>
-          <w:szCs w:val="21"/>
-        </w:rPr>
-        <w:t xml:space="preserve">Top Scorer in Intermediate (BiPC) – </w:t>
-      </w:r>
-      <w:r>
-        <w:rPr>
-          <w:rFonts w:eastAsia="Calibri" w:cs="Calibri"/>
-          <w:sz w:val="21"/>
-          <w:szCs w:val="21"/>
-        </w:rPr>
-        <w:t>Distinction grades with special excellence in Biology</w:t>
-      </w:r>
-    </w:p>
-    <w:p>
-      <w:pPr>
-        <w:spacing w:after="60" w:line="274" w:lineRule="auto"/>
-        <w:ind w:left="317" w:hanging="317"/>
-        <w:rPr>
-          <w:sz w:val="21"/>
-          <w:szCs w:val="21"/>
-        </w:rPr>
-      </w:pPr>
-      <w:r>
-        <w:rPr>
-          <w:rFonts w:eastAsia="Calibri" w:cs="Calibri"/>
-          <w:b/>
-          <w:color w:val="1B4F5C"/>
-          <w:sz w:val="21"/>
-          <w:szCs w:val="21"/>
-        </w:rPr>
-        <w:t>•</w:t>
-      </w:r>
-      <w:r>
-        <w:rPr>
-          <w:rFonts w:eastAsia="Calibri" w:cs="Calibri"/>
-          <w:b/>
-          <w:color w:val="1B4F5C"/>
-          <w:sz w:val="21"/>
-          <w:szCs w:val="21"/>
-        </w:rPr>
-        <w:tab/>
-      </w:r>
-      <w:r>
-        <w:rPr>
-          <w:rFonts w:eastAsia="Calibri" w:cs="Calibri"/>
-          <w:b/>
-          <w:color w:val="1A1A1A"/>
-          <w:sz w:val="21"/>
-          <w:szCs w:val="21"/>
-        </w:rPr>
-        <w:t xml:space="preserve">Top Scorer in Class 10 (SSC) – </w:t>
-      </w:r>
-      <w:r>
-        <w:rPr>
-          <w:rFonts w:eastAsia="Calibri" w:cs="Calibri"/>
-          <w:sz w:val="21"/>
-          <w:szCs w:val="21"/>
-        </w:rPr>
-        <w:t>Distinction with outstanding performance in Science</w:t>
-      </w:r>
-    </w:p>
-    <w:p>
-      <w:pPr>
-        <w:spacing w:after="60" w:line="274" w:lineRule="auto"/>
-        <w:ind w:left="317" w:hanging="317"/>
-        <w:rPr>
-          <w:sz w:val="21"/>
-          <w:szCs w:val="21"/>
-        </w:rPr>
-      </w:pPr>
-      <w:r>
-        <w:rPr>
-          <w:rFonts w:eastAsia="Calibri" w:cs="Calibri"/>
-          <w:b/>
-          <w:color w:val="1B4F5C"/>
-          <w:sz w:val="21"/>
-          <w:szCs w:val="21"/>
-        </w:rPr>
-        <w:t>•</w:t>
-      </w:r>
-      <w:r>
-        <w:rPr>
-          <w:rFonts w:eastAsia="Calibri" w:cs="Calibri"/>
-          <w:b/>
-          <w:color w:val="1B4F5C"/>
-          <w:sz w:val="21"/>
-          <w:szCs w:val="21"/>
-        </w:rPr>
-        <w:tab/>
-      </w:r>
-      <w:r>
-        <w:rPr>
-          <w:rFonts w:eastAsia="Calibri" w:cs="Calibri"/>
-          <w:b/>
-          <w:color w:val="1A1A1A"/>
-          <w:sz w:val="21"/>
-          <w:szCs w:val="21"/>
-        </w:rPr>
-        <w:t xml:space="preserve">Merit Certificates &amp; Scholarships – </w:t>
-      </w:r>
-      <w:r>
-        <w:rPr>
-          <w:rFonts w:eastAsia="Calibri" w:cs="Calibri"/>
-          <w:sz w:val="21"/>
-          <w:szCs w:val="21"/>
-        </w:rPr>
-        <w:t>Received multiple honors for academic excellence</w:t>
-      </w:r>
-    </w:p>
-    <w:p>
-      <w:pPr>
-        <w:spacing w:after="60" w:line="274" w:lineRule="auto"/>
-        <w:ind w:left="317" w:hanging="317"/>
-        <w:rPr>
-          <w:sz w:val="21"/>
-          <w:szCs w:val="21"/>
-        </w:rPr>
-      </w:pPr>
-      <w:r>
-        <w:rPr>
-          <w:rFonts w:eastAsia="Calibri" w:cs="Calibri"/>
-          <w:b/>
-          <w:color w:val="1B4F5C"/>
-          <w:sz w:val="21"/>
-          <w:szCs w:val="21"/>
-        </w:rPr>
-        <w:t>•</w:t>
-      </w:r>
-      <w:r>
-        <w:rPr>
-          <w:rFonts w:eastAsia="Calibri" w:cs="Calibri"/>
-          <w:b/>
-          <w:color w:val="1B4F5C"/>
-          <w:sz w:val="21"/>
-          <w:szCs w:val="21"/>
-        </w:rPr>
-        <w:tab/>
-      </w:r>
-      <w:r>
-        <w:rPr>
-          <w:rFonts w:eastAsia="Calibri" w:cs="Calibri"/>
-          <w:b/>
-          <w:color w:val="1A1A1A"/>
-          <w:sz w:val="21"/>
-          <w:szCs w:val="21"/>
-        </w:rPr>
-        <w:t xml:space="preserve">Perfect Academic Record – </w:t>
-      </w:r>
-      <w:r>
-        <w:rPr>
-          <w:rFonts w:eastAsia="Calibri" w:cs="Calibri"/>
-          <w:sz w:val="21"/>
-          <w:szCs w:val="21"/>
-        </w:rPr>
-        <w:t>Maintained consistency throughout school and college</w:t>
+        <w:t>Completed hands-on training in HPLC (High-Performance Liquid Chromatography) techniques and basic analytical laboratory procedures, developing familiarity with instrument handling, sample preparation, and accurate data recording.</w:t>
       </w:r>
     </w:p>
     <w:p>
@@ -757,7 +574,7 @@
           <w:color w:val="1B4F5C"/>
           <w:szCs w:val="21"/>
         </w:rPr>
-        <w:t>Academic Projects &amp; Laboratory Training</w:t>
+        <w:t>Certifications &amp; Training</w:t>
       </w:r>
     </w:p>
     <w:p>
@@ -797,7 +614,7 @@
           <w:sz w:val="21"/>
           <w:szCs w:val="21"/>
         </w:rPr>
-        <w:t xml:space="preserve">M.Sc. Dissertation Project – Krishna University, Machilipatnam – </w:t>
+        <w:t xml:space="preserve">National Education Policy - NEP SAARTHI – </w:t>
       </w:r>
       <w:r>
         <w:rPr>
@@ -805,64 +622,7 @@
           <w:sz w:val="21"/>
           <w:szCs w:val="21"/>
         </w:rPr>
-        <w:t xml:space="preserve">Isolated and characterized lactic acid bacteria (LAB) from spontaneously fermented fruits including apple, orange, grape, and lemon through aseptic sampling, serial dilution, and selective plating on MRS agar. Purified cultures by repeated streaking and confirmed LAB identity using </w:t>
-      </w:r>
-      <w:r>
-        <w:rPr>
-          <w:rFonts w:eastAsia="Calibri" w:cs="Calibri"/>
-          <w:sz w:val="21"/>
-          <w:szCs w:val="21"/>
-        </w:rPr>
-        <w:lastRenderedPageBreak/>
-        <w:t>Gram staining, catalase, and oxidase tests, recording colony morphology and microbial growth under controlled incubation.</w:t>
-      </w:r>
-    </w:p>
-    <w:p>
-      <w:pPr>
-        <w:spacing w:after="60" w:line="274" w:lineRule="auto"/>
-        <w:ind w:left="317" w:hanging="317"/>
-        <w:rPr>
-          <w:sz w:val="21"/>
-          <w:szCs w:val="21"/>
-        </w:rPr>
-      </w:pPr>
-      <w:r>
-        <w:rPr>
-          <w:rFonts w:eastAsia="Calibri" w:cs="Calibri"/>
-          <w:b/>
-          <w:color w:val="1B4F5C"/>
-          <w:sz w:val="21"/>
-          <w:szCs w:val="21"/>
-        </w:rPr>
-        <w:t>•</w:t>
-      </w:r>
-      <w:r>
-        <w:rPr>
-          <w:rFonts w:eastAsia="Calibri" w:cs="Calibri"/>
-          <w:b/>
-          <w:color w:val="1B4F5C"/>
-          <w:sz w:val="21"/>
-          <w:szCs w:val="21"/>
-        </w:rPr>
-        <w:tab/>
-      </w:r>
-      <w:r>
-        <w:rPr>
-          <w:rFonts w:eastAsia="Calibri" w:cs="Calibri"/>
-          <w:b/>
-          <w:color w:val="1A1A1A"/>
-          <w:sz w:val="21"/>
-          <w:szCs w:val="21"/>
-        </w:rPr>
-        <w:t xml:space="preserve">Analytical Laboratory Training – CMS Laboratories – </w:t>
-      </w:r>
-      <w:r>
-        <w:rPr>
-          <w:rFonts w:eastAsia="Calibri" w:cs="Calibri"/>
-          <w:sz w:val="21"/>
-          <w:szCs w:val="21"/>
-        </w:rPr>
-        <w:t>Completed hands-on training in HPLC (High-Performance Liquid Chromatography) techniques and basic analytical laboratory procedures, developing familiarity with instrument handling, sample preparation, and accurate data recording.</w:t>
+        <w:t>Trained in the latest education policies and pedagogical approaches</w:t>
       </w:r>
     </w:p>
     <w:p>
@@ -884,7 +644,7 @@
           <w:color w:val="1B4F5C"/>
           <w:szCs w:val="21"/>
         </w:rPr>
-        <w:t>Certifications &amp; Training</w:t>
+        <w:t>Laboratory Skills</w:t>
       </w:r>
     </w:p>
     <w:p>
@@ -924,7 +684,7 @@
           <w:sz w:val="21"/>
           <w:szCs w:val="21"/>
         </w:rPr>
-        <w:t xml:space="preserve">National Education Policy - NEP SAARTHI – </w:t>
+        <w:t xml:space="preserve">Aseptic Technique – </w:t>
       </w:r>
       <w:r>
         <w:rPr>
@@ -932,7 +692,151 @@
           <w:sz w:val="21"/>
           <w:szCs w:val="21"/>
         </w:rPr>
-        <w:t>Trained in the latest education policies and pedagogical approaches</w:t>
+        <w:t>Sample handling, equipment care, and adherence to basic laboratory protocols</w:t>
+      </w:r>
+    </w:p>
+    <w:p>
+      <w:pPr>
+        <w:spacing w:after="60" w:line="274" w:lineRule="auto"/>
+        <w:ind w:left="317" w:hanging="317"/>
+        <w:rPr>
+          <w:sz w:val="21"/>
+          <w:szCs w:val="21"/>
+        </w:rPr>
+      </w:pPr>
+      <w:r>
+        <w:rPr>
+          <w:rFonts w:eastAsia="Calibri" w:cs="Calibri"/>
+          <w:b/>
+          <w:color w:val="1B4F5C"/>
+          <w:sz w:val="21"/>
+          <w:szCs w:val="21"/>
+        </w:rPr>
+        <w:t>•</w:t>
+      </w:r>
+      <w:r>
+        <w:rPr>
+          <w:rFonts w:eastAsia="Calibri" w:cs="Calibri"/>
+          <w:b/>
+          <w:color w:val="1B4F5C"/>
+          <w:sz w:val="21"/>
+          <w:szCs w:val="21"/>
+        </w:rPr>
+        <w:tab/>
+      </w:r>
+      <w:r>
+        <w:rPr>
+          <w:rFonts w:eastAsia="Calibri" w:cs="Calibri"/>
+          <w:b/>
+          <w:color w:val="1A1A1A"/>
+          <w:sz w:val="21"/>
+          <w:szCs w:val="21"/>
+        </w:rPr>
+        <w:t xml:space="preserve">Analytical Basics – </w:t>
+      </w:r>
+      <w:r>
+        <w:rPr>
+          <w:rFonts w:eastAsia="Calibri" w:cs="Calibri"/>
+          <w:sz w:val="21"/>
+          <w:szCs w:val="21"/>
+        </w:rPr>
+        <w:t>Introductory HPLC exposure and strong academic grounding in scientific analysis</w:t>
+      </w:r>
+    </w:p>
+    <w:p>
+      <w:pPr>
+        <w:spacing w:after="60" w:line="274" w:lineRule="auto"/>
+        <w:ind w:left="317" w:hanging="317"/>
+        <w:rPr>
+          <w:sz w:val="21"/>
+          <w:szCs w:val="21"/>
+        </w:rPr>
+      </w:pPr>
+      <w:r>
+        <w:rPr>
+          <w:rFonts w:eastAsia="Calibri" w:cs="Calibri"/>
+          <w:b/>
+          <w:color w:val="1B4F5C"/>
+          <w:sz w:val="21"/>
+          <w:szCs w:val="21"/>
+        </w:rPr>
+        <w:t>•</w:t>
+      </w:r>
+      <w:r>
+        <w:rPr>
+          <w:rFonts w:eastAsia="Calibri" w:cs="Calibri"/>
+          <w:b/>
+          <w:color w:val="1B4F5C"/>
+          <w:sz w:val="21"/>
+          <w:szCs w:val="21"/>
+        </w:rPr>
+        <w:tab/>
+      </w:r>
+      <w:r>
+        <w:rPr>
+          <w:rFonts w:eastAsia="Calibri" w:cs="Calibri"/>
+          <w:b/>
+          <w:color w:val="1A1A1A"/>
+          <w:sz w:val="21"/>
+          <w:szCs w:val="21"/>
+        </w:rPr>
+        <w:t xml:space="preserve">Microbiology – </w:t>
+      </w:r>
+      <w:r>
+        <w:rPr>
+          <w:rFonts w:eastAsia="Calibri" w:cs="Calibri"/>
+          <w:sz w:val="21"/>
+          <w:szCs w:val="21"/>
+        </w:rPr>
+        <w:t>Bacterial culture, staining techniques, microscopy, and pure culture maintenance</w:t>
+      </w:r>
+    </w:p>
+    <w:p>
+      <w:pPr>
+        <w:spacing w:after="60" w:line="274" w:lineRule="auto"/>
+        <w:ind w:left="317" w:hanging="317"/>
+        <w:rPr>
+          <w:sz w:val="21"/>
+          <w:szCs w:val="21"/>
+        </w:rPr>
+      </w:pPr>
+      <w:r>
+        <w:rPr>
+          <w:rFonts w:eastAsia="Calibri" w:cs="Calibri"/>
+          <w:b/>
+          <w:color w:val="1B4F5C"/>
+          <w:sz w:val="21"/>
+          <w:szCs w:val="21"/>
+        </w:rPr>
+        <w:t>•</w:t>
+      </w:r>
+      <w:r>
+        <w:rPr>
+          <w:rFonts w:eastAsia="Calibri" w:cs="Calibri"/>
+          <w:b/>
+          <w:color w:val="1B4F5C"/>
+          <w:sz w:val="21"/>
+          <w:szCs w:val="21"/>
+        </w:rPr>
+        <w:tab/>
+      </w:r>
+      <w:r>
+        <w:rPr>
+          <w:rFonts w:eastAsia="Calibri" w:cs="Calibri"/>
+          <w:b/>
+          <w:color w:val="1A1A1A"/>
+          <w:sz w:val="21"/>
+          <w:szCs w:val="21"/>
+        </w:rPr>
+        <w:t xml:space="preserve">Documentation – </w:t>
+      </w:r>
+      <w:r>
+        <w:rPr>
+          <w:rFonts w:eastAsia="Calibri" w:cs="Calibri"/>
+          <w:sz w:val="21"/>
+          <w:szCs w:val="21"/>
+        </w:rPr>
+        <w:t>Clear written and verbal communication in Telugu and English for academic and lab reporting</w:t>
       </w:r>
     </w:p>
     <w:p>
@@ -954,12 +858,12 @@
           <w:color w:val="1B4F5C"/>
           <w:szCs w:val="21"/>
         </w:rPr>
-        <w:t>Laboratory Skills</w:t>
+        <w:t>Core Technical Competencies</w:t>
       </w:r>
     </w:p>
     <w:p>
       <w:pPr>
-        <w:spacing w:after="60" w:line="274" w:lineRule="auto"/>
+        <w:spacing w:after="0" w:line="240" w:lineRule="auto"/>
         <w:ind w:left="317" w:hanging="317"/>
         <w:rPr>
           <w:sz w:val="21"/>
@@ -994,7 +898,7 @@
           <w:sz w:val="21"/>
           <w:szCs w:val="21"/>
         </w:rPr>
-        <w:t xml:space="preserve">Aseptic Technique – </w:t>
+        <w:t xml:space="preserve">PCR – </w:t>
       </w:r>
       <w:r>
         <w:rPr>
@@ -1002,12 +906,12 @@
           <w:sz w:val="21"/>
           <w:szCs w:val="21"/>
         </w:rPr>
-        <w:t>Sample handling, equipment care, and adherence to basic laboratory protocols</w:t>
+        <w:t>Amplification and analysis of target DNA sequences</w:t>
       </w:r>
     </w:p>
     <w:p>
       <w:pPr>
-        <w:spacing w:after="60" w:line="274" w:lineRule="auto"/>
+        <w:spacing w:after="0" w:line="240" w:lineRule="auto"/>
         <w:ind w:left="317" w:hanging="317"/>
         <w:rPr>
           <w:sz w:val="21"/>
@@ -1042,7 +946,7 @@
           <w:sz w:val="21"/>
           <w:szCs w:val="21"/>
         </w:rPr>
-        <w:t xml:space="preserve">Analytical Basics – </w:t>
+        <w:t xml:space="preserve">ELISA – </w:t>
       </w:r>
       <w:r>
         <w:rPr>
@@ -1050,12 +954,12 @@
           <w:sz w:val="21"/>
           <w:szCs w:val="21"/>
         </w:rPr>
-        <w:t>Introductory HPLC exposure and strong academic grounding in scientific analysis</w:t>
+        <w:t>Antigen-antibody detection for qualitative and quantitative assays</w:t>
       </w:r>
     </w:p>
     <w:p>
       <w:pPr>
-        <w:spacing w:after="60" w:line="274" w:lineRule="auto"/>
+        <w:spacing w:after="0" w:line="240" w:lineRule="auto"/>
         <w:ind w:left="317" w:hanging="317"/>
         <w:rPr>
           <w:sz w:val="21"/>
@@ -1090,7 +994,7 @@
           <w:sz w:val="21"/>
           <w:szCs w:val="21"/>
         </w:rPr>
-        <w:t xml:space="preserve">Microbiology – </w:t>
+        <w:t xml:space="preserve">Chromatography – </w:t>
       </w:r>
       <w:r>
         <w:rPr>
@@ -1098,12 +1002,12 @@
           <w:sz w:val="21"/>
           <w:szCs w:val="21"/>
         </w:rPr>
-        <w:t>Bacterial culture, staining techniques, microscopy, and pure culture maintenance</w:t>
+        <w:t>Separation and analysis of compounds using HPLC and related methods</w:t>
       </w:r>
     </w:p>
     <w:p>
       <w:pPr>
-        <w:spacing w:after="60" w:line="274" w:lineRule="auto"/>
+        <w:spacing w:after="0" w:line="240" w:lineRule="auto"/>
         <w:ind w:left="317" w:hanging="317"/>
         <w:rPr>
           <w:sz w:val="21"/>
@@ -1138,7 +1042,7 @@
           <w:sz w:val="21"/>
           <w:szCs w:val="21"/>
         </w:rPr>
-        <w:t xml:space="preserve">Documentation – </w:t>
+        <w:t xml:space="preserve">Electrophoresis – </w:t>
       </w:r>
       <w:r>
         <w:rPr>
@@ -1146,7 +1050,295 @@
           <w:sz w:val="21"/>
           <w:szCs w:val="21"/>
         </w:rPr>
-        <w:t>Clear written and verbal communication in Telugu and English for academic and lab reporting</w:t>
+        <w:t>Gel-based separation of nucleic acids and proteins</w:t>
+      </w:r>
+    </w:p>
+    <w:p>
+      <w:pPr>
+        <w:spacing w:after="0" w:line="240" w:lineRule="auto"/>
+        <w:ind w:left="317" w:hanging="317"/>
+        <w:rPr>
+          <w:sz w:val="21"/>
+          <w:szCs w:val="21"/>
+        </w:rPr>
+      </w:pPr>
+      <w:r>
+        <w:rPr>
+          <w:rFonts w:eastAsia="Calibri" w:cs="Calibri"/>
+          <w:b/>
+          <w:color w:val="1B4F5C"/>
+          <w:sz w:val="21"/>
+          <w:szCs w:val="21"/>
+        </w:rPr>
+        <w:t>•</w:t>
+      </w:r>
+      <w:r>
+        <w:rPr>
+          <w:rFonts w:eastAsia="Calibri" w:cs="Calibri"/>
+          <w:b/>
+          <w:color w:val="1B4F5C"/>
+          <w:sz w:val="21"/>
+          <w:szCs w:val="21"/>
+        </w:rPr>
+        <w:tab/>
+      </w:r>
+      <w:r>
+        <w:rPr>
+          <w:rFonts w:eastAsia="Calibri" w:cs="Calibri"/>
+          <w:b/>
+          <w:color w:val="1A1A1A"/>
+          <w:sz w:val="21"/>
+          <w:szCs w:val="21"/>
+        </w:rPr>
+        <w:t xml:space="preserve">Gram staining – </w:t>
+      </w:r>
+      <w:r>
+        <w:rPr>
+          <w:rFonts w:eastAsia="Calibri" w:cs="Calibri"/>
+          <w:sz w:val="21"/>
+          <w:szCs w:val="21"/>
+        </w:rPr>
+        <w:t>Differentiation of bacteria using Gram-positive and Gram-negative staining</w:t>
+      </w:r>
+    </w:p>
+    <w:p>
+      <w:pPr>
+        <w:spacing w:after="0" w:line="240" w:lineRule="auto"/>
+        <w:ind w:left="317" w:hanging="317"/>
+        <w:rPr>
+          <w:sz w:val="21"/>
+          <w:szCs w:val="21"/>
+        </w:rPr>
+      </w:pPr>
+      <w:r>
+        <w:rPr>
+          <w:rFonts w:eastAsia="Calibri" w:cs="Calibri"/>
+          <w:b/>
+          <w:color w:val="1B4F5C"/>
+          <w:sz w:val="21"/>
+          <w:szCs w:val="21"/>
+        </w:rPr>
+        <w:t>•</w:t>
+      </w:r>
+      <w:r>
+        <w:rPr>
+          <w:rFonts w:eastAsia="Calibri" w:cs="Calibri"/>
+          <w:b/>
+          <w:color w:val="1B4F5C"/>
+          <w:sz w:val="21"/>
+          <w:szCs w:val="21"/>
+        </w:rPr>
+        <w:tab/>
+      </w:r>
+      <w:r>
+        <w:rPr>
+          <w:rFonts w:eastAsia="Calibri" w:cs="Calibri"/>
+          <w:b/>
+          <w:color w:val="1A1A1A"/>
+          <w:sz w:val="21"/>
+          <w:szCs w:val="21"/>
+        </w:rPr>
+        <w:t xml:space="preserve">Sterilization techniques – </w:t>
+      </w:r>
+      <w:r>
+        <w:rPr>
+          <w:rFonts w:eastAsia="Calibri" w:cs="Calibri"/>
+          <w:sz w:val="21"/>
+          <w:szCs w:val="21"/>
+        </w:rPr>
+        <w:t>Aseptic handling, autoclaving, and contamination control methods</w:t>
+      </w:r>
+    </w:p>
+    <w:p>
+      <w:pPr>
+        <w:spacing w:after="0" w:line="240" w:lineRule="auto"/>
+        <w:ind w:left="317" w:hanging="317"/>
+        <w:rPr>
+          <w:sz w:val="21"/>
+          <w:szCs w:val="21"/>
+        </w:rPr>
+      </w:pPr>
+      <w:r>
+        <w:rPr>
+          <w:rFonts w:eastAsia="Calibri" w:cs="Calibri"/>
+          <w:b/>
+          <w:color w:val="1B4F5C"/>
+          <w:sz w:val="21"/>
+          <w:szCs w:val="21"/>
+        </w:rPr>
+        <w:t>•</w:t>
+      </w:r>
+      <w:r>
+        <w:rPr>
+          <w:rFonts w:eastAsia="Calibri" w:cs="Calibri"/>
+          <w:b/>
+          <w:color w:val="1B4F5C"/>
+          <w:sz w:val="21"/>
+          <w:szCs w:val="21"/>
+        </w:rPr>
+        <w:tab/>
+      </w:r>
+      <w:r>
+        <w:rPr>
+          <w:rFonts w:eastAsia="Calibri" w:cs="Calibri"/>
+          <w:b/>
+          <w:color w:val="1A1A1A"/>
+          <w:sz w:val="21"/>
+          <w:szCs w:val="21"/>
+        </w:rPr>
+        <w:t xml:space="preserve">DNA isolation – </w:t>
+      </w:r>
+      <w:r>
+        <w:rPr>
+          <w:rFonts w:eastAsia="Calibri" w:cs="Calibri"/>
+          <w:sz w:val="21"/>
+          <w:szCs w:val="21"/>
+        </w:rPr>
+        <w:t>Extraction and purification of genomic DNA from biological samples</w:t>
+      </w:r>
+    </w:p>
+    <w:p>
+      <w:pPr>
+        <w:spacing w:after="0" w:line="240" w:lineRule="auto"/>
+        <w:ind w:left="317" w:hanging="317"/>
+        <w:rPr>
+          <w:sz w:val="21"/>
+          <w:szCs w:val="21"/>
+        </w:rPr>
+      </w:pPr>
+      <w:r>
+        <w:rPr>
+          <w:rFonts w:eastAsia="Calibri" w:cs="Calibri"/>
+          <w:b/>
+          <w:color w:val="1B4F5C"/>
+          <w:sz w:val="21"/>
+          <w:szCs w:val="21"/>
+        </w:rPr>
+        <w:t>•</w:t>
+      </w:r>
+      <w:r>
+        <w:rPr>
+          <w:rFonts w:eastAsia="Calibri" w:cs="Calibri"/>
+          <w:b/>
+          <w:color w:val="1B4F5C"/>
+          <w:sz w:val="21"/>
+          <w:szCs w:val="21"/>
+        </w:rPr>
+        <w:tab/>
+      </w:r>
+      <w:r>
+        <w:rPr>
+          <w:rFonts w:eastAsia="Calibri" w:cs="Calibri"/>
+          <w:b/>
+          <w:color w:val="1A1A1A"/>
+          <w:sz w:val="21"/>
+          <w:szCs w:val="21"/>
+        </w:rPr>
+        <w:t xml:space="preserve">Blotting techniques – </w:t>
+      </w:r>
+      <w:r>
+        <w:rPr>
+          <w:rFonts w:eastAsia="Calibri" w:cs="Calibri"/>
+          <w:sz w:val="21"/>
+          <w:szCs w:val="21"/>
+        </w:rPr>
+        <w:t>Southern, Northern, and Western blot methods for molecular analysis</w:t>
+      </w:r>
+    </w:p>
+    <w:p>
+      <w:pPr>
+        <w:spacing w:after="0" w:line="240" w:lineRule="auto"/>
+        <w:ind w:left="317" w:hanging="317"/>
+        <w:rPr>
+          <w:sz w:val="21"/>
+          <w:szCs w:val="21"/>
+        </w:rPr>
+      </w:pPr>
+      <w:r>
+        <w:rPr>
+          <w:rFonts w:eastAsia="Calibri" w:cs="Calibri"/>
+          <w:b/>
+          <w:color w:val="1B4F5C"/>
+          <w:sz w:val="21"/>
+          <w:szCs w:val="21"/>
+        </w:rPr>
+        <w:t>•</w:t>
+      </w:r>
+      <w:r>
+        <w:rPr>
+          <w:rFonts w:eastAsia="Calibri" w:cs="Calibri"/>
+          <w:b/>
+          <w:color w:val="1B4F5C"/>
+          <w:sz w:val="21"/>
+          <w:szCs w:val="21"/>
+        </w:rPr>
+        <w:tab/>
+      </w:r>
+      <w:r>
+        <w:rPr>
+          <w:rFonts w:eastAsia="Calibri" w:cs="Calibri"/>
+          <w:b/>
+          <w:color w:val="1A1A1A"/>
+          <w:sz w:val="21"/>
+          <w:szCs w:val="21"/>
+        </w:rPr>
+        <w:t xml:space="preserve">Central dogma of molecular biology – </w:t>
+      </w:r>
+      <w:r>
+        <w:rPr>
+          <w:rFonts w:eastAsia="Calibri" w:cs="Calibri"/>
+          <w:sz w:val="21"/>
+          <w:szCs w:val="21"/>
+        </w:rPr>
+        <w:t>Understanding of DNA replication, transcription, and translation in gene expression</w:t>
+      </w:r>
+    </w:p>
+    <w:p>
+      <w:pPr>
+        <w:spacing w:after="0" w:line="240" w:lineRule="auto"/>
+        <w:ind w:left="317" w:hanging="317"/>
+        <w:rPr>
+          <w:sz w:val="21"/>
+          <w:szCs w:val="21"/>
+        </w:rPr>
+      </w:pPr>
+      <w:r>
+        <w:rPr>
+          <w:rFonts w:eastAsia="Calibri" w:cs="Calibri"/>
+          <w:b/>
+          <w:color w:val="1B4F5C"/>
+          <w:sz w:val="21"/>
+          <w:szCs w:val="21"/>
+        </w:rPr>
+        <w:t>•</w:t>
+      </w:r>
+      <w:r>
+        <w:rPr>
+          <w:rFonts w:eastAsia="Calibri" w:cs="Calibri"/>
+          <w:b/>
+          <w:color w:val="1B4F5C"/>
+          <w:sz w:val="21"/>
+          <w:szCs w:val="21"/>
+        </w:rPr>
+        <w:tab/>
+      </w:r>
+      <w:r>
+        <w:rPr>
+          <w:rFonts w:eastAsia="Calibri" w:cs="Calibri"/>
+          <w:b/>
+          <w:color w:val="1A1A1A"/>
+          <w:sz w:val="21"/>
+          <w:szCs w:val="21"/>
+        </w:rPr>
+        <w:t xml:space="preserve">Data documentation – </w:t>
+      </w:r>
+      <w:r>
+        <w:rPr>
+          <w:rFonts w:eastAsia="Calibri" w:cs="Calibri"/>
+          <w:sz w:val="21"/>
+          <w:szCs w:val="21"/>
+        </w:rPr>
+        <w:t>Accurate recording, reporting, and traceability of laboratory results</w:t>
       </w:r>
     </w:p>
     <w:p>
@@ -1155,7 +1347,7 @@
         <w:pBdr>
           <w:bottom w:val="single" w:sz="6" w:space="1" w:color="1B4F5C"/>
         </w:pBdr>
-        <w:spacing w:before="140" w:after="120"/>
+        <w:spacing w:before="140" w:after="0" w:line="240" w:lineRule="auto"/>
         <w:rPr>
           <w:sz w:val="21"/>
           <w:szCs w:val="21"/>
@@ -1168,7 +1360,7 @@
           <w:color w:val="1B4F5C"/>
           <w:szCs w:val="21"/>
         </w:rPr>
-        <w:t>Core Technical Competencies</w:t>
+        <w:t>Academic Achievements</w:t>
       </w:r>
     </w:p>
     <w:p>
@@ -1208,7 +1400,7 @@
           <w:sz w:val="21"/>
           <w:szCs w:val="21"/>
         </w:rPr>
-        <w:t xml:space="preserve">PCR – </w:t>
+        <w:t xml:space="preserve">Gold Medal in M.Sc. Biotechnology – </w:t>
       </w:r>
       <w:r>
         <w:rPr>
@@ -1216,7 +1408,7 @@
           <w:sz w:val="21"/>
           <w:szCs w:val="21"/>
         </w:rPr>
-        <w:t>Amplification and analysis of target DNA sequences</w:t>
+        <w:t>Awarded for outstanding academic performance at Krishna University, Machilipatnam</w:t>
       </w:r>
     </w:p>
     <w:p>
@@ -1256,7 +1448,7 @@
           <w:sz w:val="21"/>
           <w:szCs w:val="21"/>
         </w:rPr>
-        <w:t xml:space="preserve">ELISA – </w:t>
+        <w:t xml:space="preserve">Ranked 1st in B.Sc. Biotechnology – </w:t>
       </w:r>
       <w:r>
         <w:rPr>
@@ -1264,7 +1456,7 @@
           <w:sz w:val="21"/>
           <w:szCs w:val="21"/>
         </w:rPr>
-        <w:t>Antigen-antibody detection for qualitative and quantitative assays</w:t>
+        <w:t>Consistently topped all semesters at Harshini Degree College</w:t>
       </w:r>
     </w:p>
     <w:p>
@@ -1304,7 +1496,7 @@
           <w:sz w:val="21"/>
           <w:szCs w:val="21"/>
         </w:rPr>
-        <w:t xml:space="preserve">Chromatography – </w:t>
+        <w:t xml:space="preserve">Top Scorer in Intermediate (BiPC) – </w:t>
       </w:r>
       <w:r>
         <w:rPr>
@@ -1312,7 +1504,7 @@
           <w:sz w:val="21"/>
           <w:szCs w:val="21"/>
         </w:rPr>
-        <w:t>Separation and analysis of compounds using HPLC and related methods</w:t>
+        <w:t>Distinction grades with special excellence in Biology</w:t>
       </w:r>
     </w:p>
     <w:p>
@@ -1352,7 +1544,7 @@
           <w:sz w:val="21"/>
           <w:szCs w:val="21"/>
         </w:rPr>
-        <w:t xml:space="preserve">Electrophoresis – </w:t>
+        <w:t xml:space="preserve">Top Scorer in Class 10 (SSC) – </w:t>
       </w:r>
       <w:r>
         <w:rPr>
@@ -1360,7 +1552,7 @@
           <w:sz w:val="21"/>
           <w:szCs w:val="21"/>
         </w:rPr>
-        <w:t>Gel-based separation of nucleic acids and proteins</w:t>
+        <w:t>Distinction with outstanding performance in Science</w:t>
       </w:r>
     </w:p>
     <w:p>
@@ -1400,7 +1592,7 @@
           <w:sz w:val="21"/>
           <w:szCs w:val="21"/>
         </w:rPr>
-        <w:t xml:space="preserve">Gram staining – </w:t>
+        <w:t xml:space="preserve">Merit Certificates &amp; Scholarships – </w:t>
       </w:r>
       <w:r>
         <w:rPr>
@@ -1408,7 +1600,7 @@
           <w:sz w:val="21"/>
           <w:szCs w:val="21"/>
         </w:rPr>
-        <w:t>Differentiation of bacteria using Gram-positive and Gram-negative staining</w:t>
+        <w:t>Received multiple honors for academic excellence</w:t>
       </w:r>
     </w:p>
     <w:p>
@@ -1448,7 +1640,7 @@
           <w:sz w:val="21"/>
           <w:szCs w:val="21"/>
         </w:rPr>
-        <w:t xml:space="preserve">Sterilization techniques – </w:t>
+        <w:t xml:space="preserve">Perfect Academic Record – </w:t>
       </w:r>
       <w:r>
         <w:rPr>
@@ -1456,199 +1648,7 @@
           <w:sz w:val="21"/>
           <w:szCs w:val="21"/>
         </w:rPr>
-        <w:t>Aseptic handling, autoclaving, and contamination control methods</w:t>
-      </w:r>
-    </w:p>
-    <w:p>
-      <w:pPr>
-        <w:spacing w:after="0" w:line="240" w:lineRule="auto"/>
-        <w:ind w:left="317" w:hanging="317"/>
-        <w:rPr>
-          <w:sz w:val="21"/>
-          <w:szCs w:val="21"/>
-        </w:rPr>
-      </w:pPr>
-      <w:r>
-        <w:rPr>
-          <w:rFonts w:eastAsia="Calibri" w:cs="Calibri"/>
-          <w:b/>
-          <w:color w:val="1B4F5C"/>
-          <w:sz w:val="21"/>
-          <w:szCs w:val="21"/>
-        </w:rPr>
-        <w:t>•</w:t>
-      </w:r>
-      <w:r>
-        <w:rPr>
-          <w:rFonts w:eastAsia="Calibri" w:cs="Calibri"/>
-          <w:b/>
-          <w:color w:val="1B4F5C"/>
-          <w:sz w:val="21"/>
-          <w:szCs w:val="21"/>
-        </w:rPr>
-        <w:tab/>
-      </w:r>
-      <w:r>
-        <w:rPr>
-          <w:rFonts w:eastAsia="Calibri" w:cs="Calibri"/>
-          <w:b/>
-          <w:color w:val="1A1A1A"/>
-          <w:sz w:val="21"/>
-          <w:szCs w:val="21"/>
-        </w:rPr>
-        <w:t xml:space="preserve">DNA isolation – </w:t>
-      </w:r>
-      <w:r>
-        <w:rPr>
-          <w:rFonts w:eastAsia="Calibri" w:cs="Calibri"/>
-          <w:sz w:val="21"/>
-          <w:szCs w:val="21"/>
-        </w:rPr>
-        <w:t>Extraction and purification of genomic DNA from biological samples</w:t>
-      </w:r>
-    </w:p>
-    <w:p>
-      <w:pPr>
-        <w:spacing w:after="0" w:line="240" w:lineRule="auto"/>
-        <w:ind w:left="317" w:hanging="317"/>
-        <w:rPr>
-          <w:sz w:val="21"/>
-          <w:szCs w:val="21"/>
-        </w:rPr>
-      </w:pPr>
-      <w:r>
-        <w:rPr>
-          <w:rFonts w:eastAsia="Calibri" w:cs="Calibri"/>
-          <w:b/>
-          <w:color w:val="1B4F5C"/>
-          <w:sz w:val="21"/>
-          <w:szCs w:val="21"/>
-        </w:rPr>
-        <w:t>•</w:t>
-      </w:r>
-      <w:r>
-        <w:rPr>
-          <w:rFonts w:eastAsia="Calibri" w:cs="Calibri"/>
-          <w:b/>
-          <w:color w:val="1B4F5C"/>
-          <w:sz w:val="21"/>
-          <w:szCs w:val="21"/>
-        </w:rPr>
-        <w:tab/>
-      </w:r>
-      <w:r>
-        <w:rPr>
-          <w:rFonts w:eastAsia="Calibri" w:cs="Calibri"/>
-          <w:b/>
-          <w:color w:val="1A1A1A"/>
-          <w:sz w:val="21"/>
-          <w:szCs w:val="21"/>
-        </w:rPr>
-        <w:t xml:space="preserve">Blotting techniques – </w:t>
-      </w:r>
-      <w:r>
-        <w:rPr>
-          <w:rFonts w:eastAsia="Calibri" w:cs="Calibri"/>
-          <w:sz w:val="21"/>
-          <w:szCs w:val="21"/>
-        </w:rPr>
-        <w:t>Southern, Northern, and Western blot methods for molecular analysis</w:t>
-      </w:r>
-    </w:p>
-    <w:p>
-      <w:pPr>
-        <w:spacing w:after="0" w:line="240" w:lineRule="auto"/>
-        <w:ind w:left="317" w:hanging="317"/>
-        <w:rPr>
-          <w:sz w:val="21"/>
-          <w:szCs w:val="21"/>
-        </w:rPr>
-      </w:pPr>
-      <w:r>
-        <w:rPr>
-          <w:rFonts w:eastAsia="Calibri" w:cs="Calibri"/>
-          <w:b/>
-          <w:color w:val="1B4F5C"/>
-          <w:sz w:val="21"/>
-          <w:szCs w:val="21"/>
-        </w:rPr>
-        <w:t>•</w:t>
-      </w:r>
-      <w:r>
-        <w:rPr>
-          <w:rFonts w:eastAsia="Calibri" w:cs="Calibri"/>
-          <w:b/>
-          <w:color w:val="1B4F5C"/>
-          <w:sz w:val="21"/>
-          <w:szCs w:val="21"/>
-        </w:rPr>
-        <w:tab/>
-      </w:r>
-      <w:r>
-        <w:rPr>
-          <w:rFonts w:eastAsia="Calibri" w:cs="Calibri"/>
-          <w:b/>
-          <w:color w:val="1A1A1A"/>
-          <w:sz w:val="21"/>
-          <w:szCs w:val="21"/>
-        </w:rPr>
-        <w:t xml:space="preserve">Central dogma of molecular biology – </w:t>
-      </w:r>
-      <w:r>
-        <w:rPr>
-          <w:rFonts w:eastAsia="Calibri" w:cs="Calibri"/>
-          <w:sz w:val="21"/>
-          <w:szCs w:val="21"/>
-        </w:rPr>
-        <w:t>Understanding of DNA replication, transcription, and translation in gene expression</w:t>
-      </w:r>
-    </w:p>
-    <w:p>
-      <w:pPr>
-        <w:spacing w:after="0" w:line="240" w:lineRule="auto"/>
-        <w:ind w:left="317" w:hanging="317"/>
-        <w:rPr>
-          <w:sz w:val="21"/>
-          <w:szCs w:val="21"/>
-        </w:rPr>
-      </w:pPr>
-      <w:r>
-        <w:rPr>
-          <w:rFonts w:eastAsia="Calibri" w:cs="Calibri"/>
-          <w:b/>
-          <w:color w:val="1B4F5C"/>
-          <w:sz w:val="21"/>
-          <w:szCs w:val="21"/>
-        </w:rPr>
-        <w:t>•</w:t>
-      </w:r>
-      <w:r>
-        <w:rPr>
-          <w:rFonts w:eastAsia="Calibri" w:cs="Calibri"/>
-          <w:b/>
-          <w:color w:val="1B4F5C"/>
-          <w:sz w:val="21"/>
-          <w:szCs w:val="21"/>
-        </w:rPr>
-        <w:tab/>
-      </w:r>
-      <w:r>
-        <w:rPr>
-          <w:rFonts w:eastAsia="Calibri" w:cs="Calibri"/>
-          <w:b/>
-          <w:color w:val="1A1A1A"/>
-          <w:sz w:val="21"/>
-          <w:szCs w:val="21"/>
-        </w:rPr>
-        <w:t xml:space="preserve">Data documentation – </w:t>
-      </w:r>
-      <w:r>
-        <w:rPr>
-          <w:rFonts w:eastAsia="Calibri" w:cs="Calibri"/>
-          <w:sz w:val="21"/>
-          <w:szCs w:val="21"/>
-        </w:rPr>
-        <w:t>Accurate recording, reporting, and traceability of laboratory results</w:t>
+        <w:t>Maintained consistency throughout school and college</w:t>
       </w:r>
     </w:p>
     <w:p>

</xml_diff>

<commit_message>
Rename Top Scorer achievements to Merit
Update Intermediate and Class 10 achievement labels in the resume
generator, HTML resume, print resume, and online profile.

Co-authored-by: seedarlahepsiba <seedarlahepsiba@users.noreply.github.com>
</commit_message>
<xml_diff>
--- a/chitti-profile/jessika_resume.docx
+++ b/chitti-profile/jessika_resume.docx
@@ -1496,7 +1496,7 @@
           <w:sz w:val="21"/>
           <w:szCs w:val="21"/>
         </w:rPr>
-        <w:t xml:space="preserve">Top Scorer in Intermediate (BiPC) – </w:t>
+        <w:t xml:space="preserve">Merit in Intermediate (BiPC) – </w:t>
       </w:r>
       <w:r>
         <w:rPr>
@@ -1544,7 +1544,7 @@
           <w:sz w:val="21"/>
           <w:szCs w:val="21"/>
         </w:rPr>
-        <w:t xml:space="preserve">Top Scorer in Class 10 (SSC) – </w:t>
+        <w:t xml:space="preserve">Merit in Class 10 (SSC) – </w:t>
       </w:r>
       <w:r>
         <w:rPr>

</xml_diff>

<commit_message>
Add NSS certification and reorder page-two resume sections
- Add NSS with 60% participation to Certifications & Training
- Reorder page two: Core Technical Competencies, Laboratory Skills,
  then Academic Achievements
- Update HTML resume, print resume, and online profile highlight

Co-authored-by: seedarlahepsiba <seedarlahepsiba@users.noreply.github.com>
</commit_message>
<xml_diff>
--- a/chitti-profile/jessika_resume.docx
+++ b/chitti-profile/jessika_resume.docx
@@ -627,6 +627,54 @@
     </w:p>
     <w:p>
       <w:pPr>
+        <w:spacing w:after="60" w:line="274" w:lineRule="auto"/>
+        <w:ind w:left="317" w:hanging="317"/>
+        <w:rPr>
+          <w:sz w:val="21"/>
+          <w:szCs w:val="21"/>
+        </w:rPr>
+      </w:pPr>
+      <w:r>
+        <w:rPr>
+          <w:rFonts w:eastAsia="Calibri" w:cs="Calibri"/>
+          <w:b/>
+          <w:color w:val="1B4F5C"/>
+          <w:sz w:val="21"/>
+          <w:szCs w:val="21"/>
+        </w:rPr>
+        <w:t>•</w:t>
+      </w:r>
+      <w:r>
+        <w:rPr>
+          <w:rFonts w:eastAsia="Calibri" w:cs="Calibri"/>
+          <w:b/>
+          <w:color w:val="1B4F5C"/>
+          <w:sz w:val="21"/>
+          <w:szCs w:val="21"/>
+        </w:rPr>
+        <w:tab/>
+      </w:r>
+      <w:r>
+        <w:rPr>
+          <w:rFonts w:eastAsia="Calibri" w:cs="Calibri"/>
+          <w:b/>
+          <w:color w:val="1A1A1A"/>
+          <w:sz w:val="21"/>
+          <w:szCs w:val="21"/>
+        </w:rPr>
+        <w:t xml:space="preserve">NSS (National Service Scheme) – </w:t>
+      </w:r>
+      <w:r>
+        <w:rPr>
+          <w:rFonts w:eastAsia="Calibri" w:cs="Calibri"/>
+          <w:sz w:val="21"/>
+          <w:szCs w:val="21"/>
+        </w:rPr>
+        <w:t>Participated in community service and social outreach activities with 60% attendance</w:t>
+      </w:r>
+    </w:p>
+    <w:p>
+      <w:pPr>
         <w:keepNext/>
         <w:pBdr>
           <w:bottom w:val="single" w:sz="6" w:space="1" w:color="1B4F5C"/>
@@ -644,12 +692,12 @@
           <w:color w:val="1B4F5C"/>
           <w:szCs w:val="21"/>
         </w:rPr>
-        <w:t>Laboratory Skills</w:t>
+        <w:t>Core Technical Competencies</w:t>
       </w:r>
     </w:p>
     <w:p>
       <w:pPr>
-        <w:spacing w:after="60" w:line="274" w:lineRule="auto"/>
+        <w:spacing w:after="0" w:line="240" w:lineRule="auto"/>
         <w:ind w:left="317" w:hanging="317"/>
         <w:rPr>
           <w:sz w:val="21"/>
@@ -684,20 +732,20 @@
           <w:sz w:val="21"/>
           <w:szCs w:val="21"/>
         </w:rPr>
-        <w:t xml:space="preserve">Aseptic Technique – </w:t>
-      </w:r>
-      <w:r>
-        <w:rPr>
-          <w:rFonts w:eastAsia="Calibri" w:cs="Calibri"/>
-          <w:sz w:val="21"/>
-          <w:szCs w:val="21"/>
-        </w:rPr>
-        <w:t>Sample handling, equipment care, and adherence to basic laboratory protocols</w:t>
+        <w:t xml:space="preserve">PCR – </w:t>
+      </w:r>
+      <w:r>
+        <w:rPr>
+          <w:rFonts w:eastAsia="Calibri" w:cs="Calibri"/>
+          <w:sz w:val="21"/>
+          <w:szCs w:val="21"/>
+        </w:rPr>
+        <w:t>Amplification and analysis of target DNA sequences</w:t>
       </w:r>
     </w:p>
     <w:p>
       <w:pPr>
-        <w:spacing w:after="60" w:line="274" w:lineRule="auto"/>
+        <w:spacing w:after="0" w:line="240" w:lineRule="auto"/>
         <w:ind w:left="317" w:hanging="317"/>
         <w:rPr>
           <w:sz w:val="21"/>
@@ -732,20 +780,20 @@
           <w:sz w:val="21"/>
           <w:szCs w:val="21"/>
         </w:rPr>
-        <w:t xml:space="preserve">Analytical Basics – </w:t>
-      </w:r>
-      <w:r>
-        <w:rPr>
-          <w:rFonts w:eastAsia="Calibri" w:cs="Calibri"/>
-          <w:sz w:val="21"/>
-          <w:szCs w:val="21"/>
-        </w:rPr>
-        <w:t>Introductory HPLC exposure and strong academic grounding in scientific analysis</w:t>
+        <w:t xml:space="preserve">ELISA – </w:t>
+      </w:r>
+      <w:r>
+        <w:rPr>
+          <w:rFonts w:eastAsia="Calibri" w:cs="Calibri"/>
+          <w:sz w:val="21"/>
+          <w:szCs w:val="21"/>
+        </w:rPr>
+        <w:t>Antigen-antibody detection for qualitative and quantitative assays</w:t>
       </w:r>
     </w:p>
     <w:p>
       <w:pPr>
-        <w:spacing w:after="60" w:line="274" w:lineRule="auto"/>
+        <w:spacing w:after="0" w:line="240" w:lineRule="auto"/>
         <w:ind w:left="317" w:hanging="317"/>
         <w:rPr>
           <w:sz w:val="21"/>
@@ -780,20 +828,20 @@
           <w:sz w:val="21"/>
           <w:szCs w:val="21"/>
         </w:rPr>
-        <w:t xml:space="preserve">Microbiology – </w:t>
-      </w:r>
-      <w:r>
-        <w:rPr>
-          <w:rFonts w:eastAsia="Calibri" w:cs="Calibri"/>
-          <w:sz w:val="21"/>
-          <w:szCs w:val="21"/>
-        </w:rPr>
-        <w:t>Bacterial culture, staining techniques, microscopy, and pure culture maintenance</w:t>
+        <w:t xml:space="preserve">Chromatography – </w:t>
+      </w:r>
+      <w:r>
+        <w:rPr>
+          <w:rFonts w:eastAsia="Calibri" w:cs="Calibri"/>
+          <w:sz w:val="21"/>
+          <w:szCs w:val="21"/>
+        </w:rPr>
+        <w:t>Separation and analysis of compounds using HPLC and related methods</w:t>
       </w:r>
     </w:p>
     <w:p>
       <w:pPr>
-        <w:spacing w:after="60" w:line="274" w:lineRule="auto"/>
+        <w:spacing w:after="0" w:line="240" w:lineRule="auto"/>
         <w:ind w:left="317" w:hanging="317"/>
         <w:rPr>
           <w:sz w:val="21"/>
@@ -828,15 +876,303 @@
           <w:sz w:val="21"/>
           <w:szCs w:val="21"/>
         </w:rPr>
-        <w:t xml:space="preserve">Documentation – </w:t>
-      </w:r>
-      <w:r>
-        <w:rPr>
-          <w:rFonts w:eastAsia="Calibri" w:cs="Calibri"/>
-          <w:sz w:val="21"/>
-          <w:szCs w:val="21"/>
-        </w:rPr>
-        <w:t>Clear written and verbal communication in Telugu and English for academic and lab reporting</w:t>
+        <w:t xml:space="preserve">Electrophoresis – </w:t>
+      </w:r>
+      <w:r>
+        <w:rPr>
+          <w:rFonts w:eastAsia="Calibri" w:cs="Calibri"/>
+          <w:sz w:val="21"/>
+          <w:szCs w:val="21"/>
+        </w:rPr>
+        <w:t>Gel-based separation of nucleic acids and proteins</w:t>
+      </w:r>
+    </w:p>
+    <w:p>
+      <w:pPr>
+        <w:spacing w:after="0" w:line="240" w:lineRule="auto"/>
+        <w:ind w:left="317" w:hanging="317"/>
+        <w:rPr>
+          <w:sz w:val="21"/>
+          <w:szCs w:val="21"/>
+        </w:rPr>
+      </w:pPr>
+      <w:r>
+        <w:rPr>
+          <w:rFonts w:eastAsia="Calibri" w:cs="Calibri"/>
+          <w:b/>
+          <w:color w:val="1B4F5C"/>
+          <w:sz w:val="21"/>
+          <w:szCs w:val="21"/>
+        </w:rPr>
+        <w:t>•</w:t>
+      </w:r>
+      <w:r>
+        <w:rPr>
+          <w:rFonts w:eastAsia="Calibri" w:cs="Calibri"/>
+          <w:b/>
+          <w:color w:val="1B4F5C"/>
+          <w:sz w:val="21"/>
+          <w:szCs w:val="21"/>
+        </w:rPr>
+        <w:tab/>
+      </w:r>
+      <w:r>
+        <w:rPr>
+          <w:rFonts w:eastAsia="Calibri" w:cs="Calibri"/>
+          <w:b/>
+          <w:color w:val="1A1A1A"/>
+          <w:sz w:val="21"/>
+          <w:szCs w:val="21"/>
+        </w:rPr>
+        <w:t xml:space="preserve">Gram staining – </w:t>
+      </w:r>
+      <w:r>
+        <w:rPr>
+          <w:rFonts w:eastAsia="Calibri" w:cs="Calibri"/>
+          <w:sz w:val="21"/>
+          <w:szCs w:val="21"/>
+        </w:rPr>
+        <w:t>Differentiation of bacteria using Gram-positive and Gram-negative staining</w:t>
+      </w:r>
+    </w:p>
+    <w:p>
+      <w:pPr>
+        <w:spacing w:after="0" w:line="240" w:lineRule="auto"/>
+        <w:ind w:left="317" w:hanging="317"/>
+        <w:rPr>
+          <w:sz w:val="21"/>
+          <w:szCs w:val="21"/>
+        </w:rPr>
+      </w:pPr>
+      <w:r>
+        <w:rPr>
+          <w:rFonts w:eastAsia="Calibri" w:cs="Calibri"/>
+          <w:b/>
+          <w:color w:val="1B4F5C"/>
+          <w:sz w:val="21"/>
+          <w:szCs w:val="21"/>
+        </w:rPr>
+        <w:t>•</w:t>
+      </w:r>
+      <w:r>
+        <w:rPr>
+          <w:rFonts w:eastAsia="Calibri" w:cs="Calibri"/>
+          <w:b/>
+          <w:color w:val="1B4F5C"/>
+          <w:sz w:val="21"/>
+          <w:szCs w:val="21"/>
+        </w:rPr>
+        <w:tab/>
+      </w:r>
+      <w:r>
+        <w:rPr>
+          <w:rFonts w:eastAsia="Calibri" w:cs="Calibri"/>
+          <w:b/>
+          <w:color w:val="1A1A1A"/>
+          <w:sz w:val="21"/>
+          <w:szCs w:val="21"/>
+        </w:rPr>
+        <w:t xml:space="preserve">Sterilization techniques – </w:t>
+      </w:r>
+      <w:r>
+        <w:rPr>
+          <w:rFonts w:eastAsia="Calibri" w:cs="Calibri"/>
+          <w:sz w:val="21"/>
+          <w:szCs w:val="21"/>
+        </w:rPr>
+        <w:t>Aseptic handling, autoclaving, and contamination control methods</w:t>
+      </w:r>
+    </w:p>
+    <w:p>
+      <w:pPr>
+        <w:spacing w:after="0" w:line="240" w:lineRule="auto"/>
+        <w:ind w:left="317" w:hanging="317"/>
+        <w:rPr>
+          <w:sz w:val="21"/>
+          <w:szCs w:val="21"/>
+        </w:rPr>
+      </w:pPr>
+      <w:r>
+        <w:rPr>
+          <w:rFonts w:eastAsia="Calibri" w:cs="Calibri"/>
+          <w:b/>
+          <w:color w:val="1B4F5C"/>
+          <w:sz w:val="21"/>
+          <w:szCs w:val="21"/>
+        </w:rPr>
+        <w:t>•</w:t>
+      </w:r>
+      <w:r>
+        <w:rPr>
+          <w:rFonts w:eastAsia="Calibri" w:cs="Calibri"/>
+          <w:b/>
+          <w:color w:val="1B4F5C"/>
+          <w:sz w:val="21"/>
+          <w:szCs w:val="21"/>
+        </w:rPr>
+        <w:tab/>
+      </w:r>
+      <w:r>
+        <w:rPr>
+          <w:rFonts w:eastAsia="Calibri" w:cs="Calibri"/>
+          <w:b/>
+          <w:color w:val="1A1A1A"/>
+          <w:sz w:val="21"/>
+          <w:szCs w:val="21"/>
+        </w:rPr>
+        <w:t xml:space="preserve">DNA isolation – </w:t>
+      </w:r>
+      <w:r>
+        <w:rPr>
+          <w:rFonts w:eastAsia="Calibri" w:cs="Calibri"/>
+          <w:sz w:val="21"/>
+          <w:szCs w:val="21"/>
+        </w:rPr>
+        <w:t>Extraction and purification of genomic DNA from biological samples</w:t>
+      </w:r>
+    </w:p>
+    <w:p>
+      <w:pPr>
+        <w:spacing w:after="0" w:line="240" w:lineRule="auto"/>
+        <w:ind w:left="317" w:hanging="317"/>
+        <w:rPr>
+          <w:sz w:val="21"/>
+          <w:szCs w:val="21"/>
+        </w:rPr>
+      </w:pPr>
+      <w:r>
+        <w:rPr>
+          <w:rFonts w:eastAsia="Calibri" w:cs="Calibri"/>
+          <w:b/>
+          <w:color w:val="1B4F5C"/>
+          <w:sz w:val="21"/>
+          <w:szCs w:val="21"/>
+        </w:rPr>
+        <w:t>•</w:t>
+      </w:r>
+      <w:r>
+        <w:rPr>
+          <w:rFonts w:eastAsia="Calibri" w:cs="Calibri"/>
+          <w:b/>
+          <w:color w:val="1B4F5C"/>
+          <w:sz w:val="21"/>
+          <w:szCs w:val="21"/>
+        </w:rPr>
+        <w:tab/>
+      </w:r>
+      <w:r>
+        <w:rPr>
+          <w:rFonts w:eastAsia="Calibri" w:cs="Calibri"/>
+          <w:b/>
+          <w:color w:val="1A1A1A"/>
+          <w:sz w:val="21"/>
+          <w:szCs w:val="21"/>
+        </w:rPr>
+        <w:t xml:space="preserve">Blotting techniques – </w:t>
+      </w:r>
+      <w:r>
+        <w:rPr>
+          <w:rFonts w:eastAsia="Calibri" w:cs="Calibri"/>
+          <w:sz w:val="21"/>
+          <w:szCs w:val="21"/>
+        </w:rPr>
+        <w:t>Southern, Northern, and Western blot methods for molecular analysis</w:t>
+      </w:r>
+    </w:p>
+    <w:p>
+      <w:pPr>
+        <w:spacing w:after="0" w:line="240" w:lineRule="auto"/>
+        <w:ind w:left="317" w:hanging="317"/>
+        <w:rPr>
+          <w:sz w:val="21"/>
+          <w:szCs w:val="21"/>
+        </w:rPr>
+      </w:pPr>
+      <w:r>
+        <w:rPr>
+          <w:rFonts w:eastAsia="Calibri" w:cs="Calibri"/>
+          <w:b/>
+          <w:color w:val="1B4F5C"/>
+          <w:sz w:val="21"/>
+          <w:szCs w:val="21"/>
+        </w:rPr>
+        <w:t>•</w:t>
+      </w:r>
+      <w:r>
+        <w:rPr>
+          <w:rFonts w:eastAsia="Calibri" w:cs="Calibri"/>
+          <w:b/>
+          <w:color w:val="1B4F5C"/>
+          <w:sz w:val="21"/>
+          <w:szCs w:val="21"/>
+        </w:rPr>
+        <w:tab/>
+      </w:r>
+      <w:r>
+        <w:rPr>
+          <w:rFonts w:eastAsia="Calibri" w:cs="Calibri"/>
+          <w:b/>
+          <w:color w:val="1A1A1A"/>
+          <w:sz w:val="21"/>
+          <w:szCs w:val="21"/>
+        </w:rPr>
+        <w:t xml:space="preserve">Central dogma of molecular biology – </w:t>
+      </w:r>
+      <w:r>
+        <w:rPr>
+          <w:rFonts w:eastAsia="Calibri" w:cs="Calibri"/>
+          <w:sz w:val="21"/>
+          <w:szCs w:val="21"/>
+        </w:rPr>
+        <w:t>Understanding of DNA replication, transcription, and translation in gene expression</w:t>
+      </w:r>
+    </w:p>
+    <w:p>
+      <w:pPr>
+        <w:spacing w:after="0" w:line="240" w:lineRule="auto"/>
+        <w:ind w:left="317" w:hanging="317"/>
+        <w:rPr>
+          <w:sz w:val="21"/>
+          <w:szCs w:val="21"/>
+        </w:rPr>
+      </w:pPr>
+      <w:r>
+        <w:rPr>
+          <w:rFonts w:eastAsia="Calibri" w:cs="Calibri"/>
+          <w:b/>
+          <w:color w:val="1B4F5C"/>
+          <w:sz w:val="21"/>
+          <w:szCs w:val="21"/>
+        </w:rPr>
+        <w:t>•</w:t>
+      </w:r>
+      <w:r>
+        <w:rPr>
+          <w:rFonts w:eastAsia="Calibri" w:cs="Calibri"/>
+          <w:b/>
+          <w:color w:val="1B4F5C"/>
+          <w:sz w:val="21"/>
+          <w:szCs w:val="21"/>
+        </w:rPr>
+        <w:tab/>
+      </w:r>
+      <w:r>
+        <w:rPr>
+          <w:rFonts w:eastAsia="Calibri" w:cs="Calibri"/>
+          <w:b/>
+          <w:color w:val="1A1A1A"/>
+          <w:sz w:val="21"/>
+          <w:szCs w:val="21"/>
+        </w:rPr>
+        <w:t xml:space="preserve">Data documentation – </w:t>
+      </w:r>
+      <w:r>
+        <w:rPr>
+          <w:rFonts w:eastAsia="Calibri" w:cs="Calibri"/>
+          <w:sz w:val="21"/>
+          <w:szCs w:val="21"/>
+        </w:rPr>
+        <w:t>Accurate recording, reporting, and traceability of laboratory results</w:t>
       </w:r>
     </w:p>
     <w:p>
@@ -858,7 +1194,7 @@
           <w:color w:val="1B4F5C"/>
           <w:szCs w:val="21"/>
         </w:rPr>
-        <w:t>Core Technical Competencies</w:t>
+        <w:t>Laboratory Skills</w:t>
       </w:r>
     </w:p>
     <w:p>
@@ -898,15 +1234,15 @@
           <w:sz w:val="21"/>
           <w:szCs w:val="21"/>
         </w:rPr>
-        <w:t xml:space="preserve">PCR – </w:t>
-      </w:r>
-      <w:r>
-        <w:rPr>
-          <w:rFonts w:eastAsia="Calibri" w:cs="Calibri"/>
-          <w:sz w:val="21"/>
-          <w:szCs w:val="21"/>
-        </w:rPr>
-        <w:t>Amplification and analysis of target DNA sequences</w:t>
+        <w:t xml:space="preserve">Aseptic Technique – </w:t>
+      </w:r>
+      <w:r>
+        <w:rPr>
+          <w:rFonts w:eastAsia="Calibri" w:cs="Calibri"/>
+          <w:sz w:val="21"/>
+          <w:szCs w:val="21"/>
+        </w:rPr>
+        <w:t>Sample handling, equipment care, and adherence to basic laboratory protocols</w:t>
       </w:r>
     </w:p>
     <w:p>
@@ -946,15 +1282,15 @@
           <w:sz w:val="21"/>
           <w:szCs w:val="21"/>
         </w:rPr>
-        <w:t xml:space="preserve">ELISA – </w:t>
-      </w:r>
-      <w:r>
-        <w:rPr>
-          <w:rFonts w:eastAsia="Calibri" w:cs="Calibri"/>
-          <w:sz w:val="21"/>
-          <w:szCs w:val="21"/>
-        </w:rPr>
-        <w:t>Antigen-antibody detection for qualitative and quantitative assays</w:t>
+        <w:t xml:space="preserve">Analytical Basics – </w:t>
+      </w:r>
+      <w:r>
+        <w:rPr>
+          <w:rFonts w:eastAsia="Calibri" w:cs="Calibri"/>
+          <w:sz w:val="21"/>
+          <w:szCs w:val="21"/>
+        </w:rPr>
+        <w:t>Introductory HPLC exposure and strong academic grounding in scientific analysis</w:t>
       </w:r>
     </w:p>
     <w:p>
@@ -994,15 +1330,15 @@
           <w:sz w:val="21"/>
           <w:szCs w:val="21"/>
         </w:rPr>
-        <w:t xml:space="preserve">Chromatography – </w:t>
-      </w:r>
-      <w:r>
-        <w:rPr>
-          <w:rFonts w:eastAsia="Calibri" w:cs="Calibri"/>
-          <w:sz w:val="21"/>
-          <w:szCs w:val="21"/>
-        </w:rPr>
-        <w:t>Separation and analysis of compounds using HPLC and related methods</w:t>
+        <w:t xml:space="preserve">Microbiology – </w:t>
+      </w:r>
+      <w:r>
+        <w:rPr>
+          <w:rFonts w:eastAsia="Calibri" w:cs="Calibri"/>
+          <w:sz w:val="21"/>
+          <w:szCs w:val="21"/>
+        </w:rPr>
+        <w:t>Bacterial culture, staining techniques, microscopy, and pure culture maintenance</w:t>
       </w:r>
     </w:p>
     <w:p>
@@ -1042,303 +1378,15 @@
           <w:sz w:val="21"/>
           <w:szCs w:val="21"/>
         </w:rPr>
-        <w:t xml:space="preserve">Electrophoresis – </w:t>
-      </w:r>
-      <w:r>
-        <w:rPr>
-          <w:rFonts w:eastAsia="Calibri" w:cs="Calibri"/>
-          <w:sz w:val="21"/>
-          <w:szCs w:val="21"/>
-        </w:rPr>
-        <w:t>Gel-based separation of nucleic acids and proteins</w:t>
-      </w:r>
-    </w:p>
-    <w:p>
-      <w:pPr>
-        <w:spacing w:after="0" w:line="240" w:lineRule="auto"/>
-        <w:ind w:left="317" w:hanging="317"/>
-        <w:rPr>
-          <w:sz w:val="21"/>
-          <w:szCs w:val="21"/>
-        </w:rPr>
-      </w:pPr>
-      <w:r>
-        <w:rPr>
-          <w:rFonts w:eastAsia="Calibri" w:cs="Calibri"/>
-          <w:b/>
-          <w:color w:val="1B4F5C"/>
-          <w:sz w:val="21"/>
-          <w:szCs w:val="21"/>
-        </w:rPr>
-        <w:t>•</w:t>
-      </w:r>
-      <w:r>
-        <w:rPr>
-          <w:rFonts w:eastAsia="Calibri" w:cs="Calibri"/>
-          <w:b/>
-          <w:color w:val="1B4F5C"/>
-          <w:sz w:val="21"/>
-          <w:szCs w:val="21"/>
-        </w:rPr>
-        <w:tab/>
-      </w:r>
-      <w:r>
-        <w:rPr>
-          <w:rFonts w:eastAsia="Calibri" w:cs="Calibri"/>
-          <w:b/>
-          <w:color w:val="1A1A1A"/>
-          <w:sz w:val="21"/>
-          <w:szCs w:val="21"/>
-        </w:rPr>
-        <w:t xml:space="preserve">Gram staining – </w:t>
-      </w:r>
-      <w:r>
-        <w:rPr>
-          <w:rFonts w:eastAsia="Calibri" w:cs="Calibri"/>
-          <w:sz w:val="21"/>
-          <w:szCs w:val="21"/>
-        </w:rPr>
-        <w:t>Differentiation of bacteria using Gram-positive and Gram-negative staining</w:t>
-      </w:r>
-    </w:p>
-    <w:p>
-      <w:pPr>
-        <w:spacing w:after="0" w:line="240" w:lineRule="auto"/>
-        <w:ind w:left="317" w:hanging="317"/>
-        <w:rPr>
-          <w:sz w:val="21"/>
-          <w:szCs w:val="21"/>
-        </w:rPr>
-      </w:pPr>
-      <w:r>
-        <w:rPr>
-          <w:rFonts w:eastAsia="Calibri" w:cs="Calibri"/>
-          <w:b/>
-          <w:color w:val="1B4F5C"/>
-          <w:sz w:val="21"/>
-          <w:szCs w:val="21"/>
-        </w:rPr>
-        <w:t>•</w:t>
-      </w:r>
-      <w:r>
-        <w:rPr>
-          <w:rFonts w:eastAsia="Calibri" w:cs="Calibri"/>
-          <w:b/>
-          <w:color w:val="1B4F5C"/>
-          <w:sz w:val="21"/>
-          <w:szCs w:val="21"/>
-        </w:rPr>
-        <w:tab/>
-      </w:r>
-      <w:r>
-        <w:rPr>
-          <w:rFonts w:eastAsia="Calibri" w:cs="Calibri"/>
-          <w:b/>
-          <w:color w:val="1A1A1A"/>
-          <w:sz w:val="21"/>
-          <w:szCs w:val="21"/>
-        </w:rPr>
-        <w:t xml:space="preserve">Sterilization techniques – </w:t>
-      </w:r>
-      <w:r>
-        <w:rPr>
-          <w:rFonts w:eastAsia="Calibri" w:cs="Calibri"/>
-          <w:sz w:val="21"/>
-          <w:szCs w:val="21"/>
-        </w:rPr>
-        <w:t>Aseptic handling, autoclaving, and contamination control methods</w:t>
-      </w:r>
-    </w:p>
-    <w:p>
-      <w:pPr>
-        <w:spacing w:after="0" w:line="240" w:lineRule="auto"/>
-        <w:ind w:left="317" w:hanging="317"/>
-        <w:rPr>
-          <w:sz w:val="21"/>
-          <w:szCs w:val="21"/>
-        </w:rPr>
-      </w:pPr>
-      <w:r>
-        <w:rPr>
-          <w:rFonts w:eastAsia="Calibri" w:cs="Calibri"/>
-          <w:b/>
-          <w:color w:val="1B4F5C"/>
-          <w:sz w:val="21"/>
-          <w:szCs w:val="21"/>
-        </w:rPr>
-        <w:t>•</w:t>
-      </w:r>
-      <w:r>
-        <w:rPr>
-          <w:rFonts w:eastAsia="Calibri" w:cs="Calibri"/>
-          <w:b/>
-          <w:color w:val="1B4F5C"/>
-          <w:sz w:val="21"/>
-          <w:szCs w:val="21"/>
-        </w:rPr>
-        <w:tab/>
-      </w:r>
-      <w:r>
-        <w:rPr>
-          <w:rFonts w:eastAsia="Calibri" w:cs="Calibri"/>
-          <w:b/>
-          <w:color w:val="1A1A1A"/>
-          <w:sz w:val="21"/>
-          <w:szCs w:val="21"/>
-        </w:rPr>
-        <w:t xml:space="preserve">DNA isolation – </w:t>
-      </w:r>
-      <w:r>
-        <w:rPr>
-          <w:rFonts w:eastAsia="Calibri" w:cs="Calibri"/>
-          <w:sz w:val="21"/>
-          <w:szCs w:val="21"/>
-        </w:rPr>
-        <w:t>Extraction and purification of genomic DNA from biological samples</w:t>
-      </w:r>
-    </w:p>
-    <w:p>
-      <w:pPr>
-        <w:spacing w:after="0" w:line="240" w:lineRule="auto"/>
-        <w:ind w:left="317" w:hanging="317"/>
-        <w:rPr>
-          <w:sz w:val="21"/>
-          <w:szCs w:val="21"/>
-        </w:rPr>
-      </w:pPr>
-      <w:r>
-        <w:rPr>
-          <w:rFonts w:eastAsia="Calibri" w:cs="Calibri"/>
-          <w:b/>
-          <w:color w:val="1B4F5C"/>
-          <w:sz w:val="21"/>
-          <w:szCs w:val="21"/>
-        </w:rPr>
-        <w:t>•</w:t>
-      </w:r>
-      <w:r>
-        <w:rPr>
-          <w:rFonts w:eastAsia="Calibri" w:cs="Calibri"/>
-          <w:b/>
-          <w:color w:val="1B4F5C"/>
-          <w:sz w:val="21"/>
-          <w:szCs w:val="21"/>
-        </w:rPr>
-        <w:tab/>
-      </w:r>
-      <w:r>
-        <w:rPr>
-          <w:rFonts w:eastAsia="Calibri" w:cs="Calibri"/>
-          <w:b/>
-          <w:color w:val="1A1A1A"/>
-          <w:sz w:val="21"/>
-          <w:szCs w:val="21"/>
-        </w:rPr>
-        <w:t xml:space="preserve">Blotting techniques – </w:t>
-      </w:r>
-      <w:r>
-        <w:rPr>
-          <w:rFonts w:eastAsia="Calibri" w:cs="Calibri"/>
-          <w:sz w:val="21"/>
-          <w:szCs w:val="21"/>
-        </w:rPr>
-        <w:t>Southern, Northern, and Western blot methods for molecular analysis</w:t>
-      </w:r>
-    </w:p>
-    <w:p>
-      <w:pPr>
-        <w:spacing w:after="0" w:line="240" w:lineRule="auto"/>
-        <w:ind w:left="317" w:hanging="317"/>
-        <w:rPr>
-          <w:sz w:val="21"/>
-          <w:szCs w:val="21"/>
-        </w:rPr>
-      </w:pPr>
-      <w:r>
-        <w:rPr>
-          <w:rFonts w:eastAsia="Calibri" w:cs="Calibri"/>
-          <w:b/>
-          <w:color w:val="1B4F5C"/>
-          <w:sz w:val="21"/>
-          <w:szCs w:val="21"/>
-        </w:rPr>
-        <w:t>•</w:t>
-      </w:r>
-      <w:r>
-        <w:rPr>
-          <w:rFonts w:eastAsia="Calibri" w:cs="Calibri"/>
-          <w:b/>
-          <w:color w:val="1B4F5C"/>
-          <w:sz w:val="21"/>
-          <w:szCs w:val="21"/>
-        </w:rPr>
-        <w:tab/>
-      </w:r>
-      <w:r>
-        <w:rPr>
-          <w:rFonts w:eastAsia="Calibri" w:cs="Calibri"/>
-          <w:b/>
-          <w:color w:val="1A1A1A"/>
-          <w:sz w:val="21"/>
-          <w:szCs w:val="21"/>
-        </w:rPr>
-        <w:t xml:space="preserve">Central dogma of molecular biology – </w:t>
-      </w:r>
-      <w:r>
-        <w:rPr>
-          <w:rFonts w:eastAsia="Calibri" w:cs="Calibri"/>
-          <w:sz w:val="21"/>
-          <w:szCs w:val="21"/>
-        </w:rPr>
-        <w:t>Understanding of DNA replication, transcription, and translation in gene expression</w:t>
-      </w:r>
-    </w:p>
-    <w:p>
-      <w:pPr>
-        <w:spacing w:after="0" w:line="240" w:lineRule="auto"/>
-        <w:ind w:left="317" w:hanging="317"/>
-        <w:rPr>
-          <w:sz w:val="21"/>
-          <w:szCs w:val="21"/>
-        </w:rPr>
-      </w:pPr>
-      <w:r>
-        <w:rPr>
-          <w:rFonts w:eastAsia="Calibri" w:cs="Calibri"/>
-          <w:b/>
-          <w:color w:val="1B4F5C"/>
-          <w:sz w:val="21"/>
-          <w:szCs w:val="21"/>
-        </w:rPr>
-        <w:t>•</w:t>
-      </w:r>
-      <w:r>
-        <w:rPr>
-          <w:rFonts w:eastAsia="Calibri" w:cs="Calibri"/>
-          <w:b/>
-          <w:color w:val="1B4F5C"/>
-          <w:sz w:val="21"/>
-          <w:szCs w:val="21"/>
-        </w:rPr>
-        <w:tab/>
-      </w:r>
-      <w:r>
-        <w:rPr>
-          <w:rFonts w:eastAsia="Calibri" w:cs="Calibri"/>
-          <w:b/>
-          <w:color w:val="1A1A1A"/>
-          <w:sz w:val="21"/>
-          <w:szCs w:val="21"/>
-        </w:rPr>
-        <w:t xml:space="preserve">Data documentation – </w:t>
-      </w:r>
-      <w:r>
-        <w:rPr>
-          <w:rFonts w:eastAsia="Calibri" w:cs="Calibri"/>
-          <w:sz w:val="21"/>
-          <w:szCs w:val="21"/>
-        </w:rPr>
-        <w:t>Accurate recording, reporting, and traceability of laboratory results</w:t>
+        <w:t xml:space="preserve">Documentation – </w:t>
+      </w:r>
+      <w:r>
+        <w:rPr>
+          <w:rFonts w:eastAsia="Calibri" w:cs="Calibri"/>
+          <w:sz w:val="21"/>
+          <w:szCs w:val="21"/>
+        </w:rPr>
+        <w:t>Clear written and verbal communication in Telugu and English for academic and lab reporting</w:t>
       </w:r>
     </w:p>
     <w:p>
@@ -1347,7 +1395,7 @@
         <w:pBdr>
           <w:bottom w:val="single" w:sz="6" w:space="1" w:color="1B4F5C"/>
         </w:pBdr>
-        <w:spacing w:before="140" w:after="0" w:line="240" w:lineRule="auto"/>
+        <w:spacing w:before="140" w:after="120"/>
         <w:rPr>
           <w:sz w:val="21"/>
           <w:szCs w:val="21"/>

</xml_diff>